<commit_message>
docs: restructure UAT form to Poor-Excellent criteria checklist
Rework the UAT form to the requested layout: Tester Name / Job Position / Date
header, a single criteria table rated 1 (Poor) - 5 (Excellent) grouped into
Meeting System Objectives, User Interface, User Experience, System
Functionality, and System Reliability, with a checkbox (checkbox) in every
rating column so testers can mark it in Word (replace with X). Adds Tester
Comments and Suggestions for Improvement / Actions Taken sections.
Word (.docx) is the primary fill-in format; PDF + Markdown regenerated to match.
</commit_message>
<xml_diff>
--- a/docs/UAT_Form.docx
+++ b/docs/UAT_Form.docx
@@ -38,7 +38,23 @@
         <w:t xml:space="preserve"> </w:t>
       </w:r>
       <w:r>
-        <w:t xml:space="preserve">Thank you for helping evaluate VulnTriage. First, please use the system to (1) register &amp; log in, (2) upload a scanner report and run the triage, (3) read the dashboard, (4) open a Confirmed finding and its rationale, (5) run an authorised Auto Scan, and (6) generate the PDF report. Then rate each statement below by placing a tick (✓) in the column that best matches your opinion. There are no right or wrong answers.</w:t>
+        <w:t xml:space="preserve">Thank you for helping evaluate VulnTriage. Please use the system (register &amp; log in, upload a scanner report and run the triage, review the dashboard and a finding's details, run an authorised Auto Scan, and generate the PDF report), then rate each statement below. To answer in Word, replace the ☐ in your chosen column with ☒ (or type an</w:t>
+      </w:r>
+      <w:r>
+        <w:t xml:space="preserve"> </w:t>
+      </w:r>
+      <w:r>
+        <w:rPr>
+          <w:b/>
+          <w:bCs/>
+        </w:rPr>
+        <w:t xml:space="preserve">X</w:t>
+      </w:r>
+      <w:r>
+        <w:t xml:space="preserve"> </w:t>
+      </w:r>
+      <w:r>
+        <w:t xml:space="preserve">over it). There are no right or wrong answers.</w:t>
       </w:r>
     </w:p>
     <w:p>
@@ -75,72 +91,83 @@
         <w:t xml:space="preserve">against the provided, deliberately-vulnerable practice target (e.g. a local OWASP Juice Shop).</w:t>
       </w:r>
     </w:p>
-    <w:p>
-      <w:pPr>
-        <w:pStyle w:val="FirstParagraph"/>
-      </w:pPr>
-      <w:r>
-        <w:rPr>
-          <w:b/>
-          <w:bCs/>
-        </w:rPr>
-        <w:t xml:space="preserve">Name:</w:t>
-      </w:r>
-      <w:r>
-        <w:t xml:space="preserve"> </w:t>
-      </w:r>
-      <w:r>
-        <w:t xml:space="preserve">________________________</w:t>
-      </w:r>
-      <w:r>
-        <w:t xml:space="preserve"> </w:t>
-      </w:r>
-      <w:r>
-        <w:rPr>
-          <w:b/>
-          <w:bCs/>
-        </w:rPr>
-        <w:t xml:space="preserve">Role:</w:t>
-      </w:r>
-      <w:r>
-        <w:t xml:space="preserve"> </w:t>
-      </w:r>
-      <w:r>
-        <w:t xml:space="preserve">______________</w:t>
-      </w:r>
-      <w:r>
-        <w:t xml:space="preserve"> </w:t>
-      </w:r>
-      <w:r>
-        <w:rPr>
-          <w:b/>
-          <w:bCs/>
-        </w:rPr>
-        <w:t xml:space="preserve">Age:</w:t>
-      </w:r>
-      <w:r>
-        <w:t xml:space="preserve"> </w:t>
-      </w:r>
-      <w:r>
-        <w:t xml:space="preserve">______</w:t>
-      </w:r>
-      <w:r>
-        <w:t xml:space="preserve"> </w:t>
-      </w:r>
-      <w:r>
-        <w:rPr>
-          <w:b/>
-          <w:bCs/>
-        </w:rPr>
-        <w:t xml:space="preserve">Date:</w:t>
-      </w:r>
-      <w:r>
-        <w:t xml:space="preserve"> </w:t>
-      </w:r>
-      <w:r>
-        <w:t xml:space="preserve">__________</w:t>
-      </w:r>
-    </w:p>
+    <w:tbl>
+      <w:tblPr>
+        <w:tblStyle w:val="Table"/>
+        <w:tblW w:type="auto" w:w="0"/>
+        <w:tblLook w:firstRow="1" w:lastRow="0" w:firstColumn="0" w:lastColumn="0" w:noHBand="0" w:noVBand="0" w:val="0020"/>
+      </w:tblPr>
+      <w:tblGrid>
+        <w:gridCol w:w="3960"/>
+        <w:gridCol w:w="3960"/>
+      </w:tblGrid>
+      <w:tr>
+        <w:trPr>
+          <w:tblHeader w:val="on"/>
+        </w:trPr>
+        <w:tc>
+          <w:tcPr/>
+          <w:p>
+            <w:pPr>
+              <w:pStyle w:val="Compact"/>
+            </w:pPr>
+            <w:r>
+              <w:t xml:space="preserve">Tester Name</w:t>
+            </w:r>
+          </w:p>
+        </w:tc>
+        <w:tc>
+          <w:tcPr/>
+          <w:p>
+            <w:pPr>
+              <w:pStyle w:val="Compact"/>
+            </w:pPr>
+          </w:p>
+        </w:tc>
+      </w:tr>
+      <w:tr>
+        <w:tc>
+          <w:tcPr/>
+          <w:p>
+            <w:pPr>
+              <w:pStyle w:val="Compact"/>
+            </w:pPr>
+            <w:r>
+              <w:t xml:space="preserve">Job Position</w:t>
+            </w:r>
+          </w:p>
+        </w:tc>
+        <w:tc>
+          <w:tcPr/>
+          <w:p>
+            <w:pPr>
+              <w:pStyle w:val="Compact"/>
+            </w:pPr>
+          </w:p>
+        </w:tc>
+      </w:tr>
+      <w:tr>
+        <w:tc>
+          <w:tcPr/>
+          <w:p>
+            <w:pPr>
+              <w:pStyle w:val="Compact"/>
+            </w:pPr>
+            <w:r>
+              <w:t xml:space="preserve">Date</w:t>
+            </w:r>
+          </w:p>
+        </w:tc>
+        <w:tc>
+          <w:tcPr/>
+          <w:p>
+            <w:pPr>
+              <w:pStyle w:val="Compact"/>
+            </w:pPr>
+          </w:p>
+        </w:tc>
+      </w:tr>
+    </w:tbl>
     <w:p>
       <w:pPr>
         <w:pStyle w:val="BodyText"/>
@@ -150,35 +177,7 @@
           <w:b/>
           <w:bCs/>
         </w:rPr>
-        <w:t xml:space="preserve">Security-tool experience:</w:t>
-      </w:r>
-      <w:r>
-        <w:t xml:space="preserve"> </w:t>
-      </w:r>
-      <w:r>
-        <w:t xml:space="preserve">None / Some / Experienced</w:t>
-      </w:r>
-      <w:r>
-        <w:t xml:space="preserve"> </w:t>
-      </w:r>
-      <w:r>
-        <w:rPr>
-          <w:i/>
-          <w:iCs/>
-        </w:rPr>
-        <w:t xml:space="preserve">(circle one)</w:t>
-      </w:r>
-    </w:p>
-    <w:p>
-      <w:pPr>
-        <w:pStyle w:val="BodyText"/>
-      </w:pPr>
-      <w:r>
-        <w:rPr>
-          <w:i/>
-          <w:iCs/>
-        </w:rPr>
-        <w:t xml:space="preserve">Scale: 1 = Strongly disagree · 2 = Disagree · 3 = Neutral · 4 = Agree · 5 = Strongly agree</w:t>
+        <w:t xml:space="preserve">Rating (1 = Poor, 5 = Excellent)</w:t>
       </w:r>
     </w:p>
     <w:tbl>
@@ -206,7 +205,7 @@
               <w:pStyle w:val="Compact"/>
             </w:pPr>
             <w:r>
-              <w:t xml:space="preserve">Please tick (✓) one column per row</w:t>
+              <w:t xml:space="preserve">Criteria</w:t>
             </w:r>
           </w:p>
         </w:tc>
@@ -283,7 +282,7 @@
                 <w:b/>
                 <w:bCs/>
               </w:rPr>
-              <w:t xml:space="preserve">A · USER INTERFACE &amp; USABILITY</w:t>
+              <w:t xml:space="preserve">Meeting System Objectives</w:t>
             </w:r>
           </w:p>
         </w:tc>
@@ -336,48 +335,68 @@
               <w:pStyle w:val="Compact"/>
             </w:pPr>
             <w:r>
-              <w:t xml:space="preserve">1. The dashboard layout is clear and well-organised.</w:t>
-            </w:r>
-          </w:p>
-        </w:tc>
-        <w:tc>
-          <w:tcPr/>
-          <w:p>
-            <w:pPr>
-              <w:pStyle w:val="Compact"/>
-            </w:pPr>
-          </w:p>
-        </w:tc>
-        <w:tc>
-          <w:tcPr/>
-          <w:p>
-            <w:pPr>
-              <w:pStyle w:val="Compact"/>
-            </w:pPr>
-          </w:p>
-        </w:tc>
-        <w:tc>
-          <w:tcPr/>
-          <w:p>
-            <w:pPr>
-              <w:pStyle w:val="Compact"/>
-            </w:pPr>
-          </w:p>
-        </w:tc>
-        <w:tc>
-          <w:tcPr/>
-          <w:p>
-            <w:pPr>
-              <w:pStyle w:val="Compact"/>
-            </w:pPr>
-          </w:p>
-        </w:tc>
-        <w:tc>
-          <w:tcPr/>
-          <w:p>
-            <w:pPr>
-              <w:pStyle w:val="Compact"/>
-            </w:pPr>
+              <w:t xml:space="preserve">• Multi-scanner vulnerability report processing</w:t>
+            </w:r>
+          </w:p>
+        </w:tc>
+        <w:tc>
+          <w:tcPr/>
+          <w:p>
+            <w:pPr>
+              <w:pStyle w:val="Compact"/>
+              <w:jc w:val="center"/>
+            </w:pPr>
+            <w:r>
+              <w:t xml:space="preserve">☐</w:t>
+            </w:r>
+          </w:p>
+        </w:tc>
+        <w:tc>
+          <w:tcPr/>
+          <w:p>
+            <w:pPr>
+              <w:pStyle w:val="Compact"/>
+              <w:jc w:val="center"/>
+            </w:pPr>
+            <w:r>
+              <w:t xml:space="preserve">☐</w:t>
+            </w:r>
+          </w:p>
+        </w:tc>
+        <w:tc>
+          <w:tcPr/>
+          <w:p>
+            <w:pPr>
+              <w:pStyle w:val="Compact"/>
+              <w:jc w:val="center"/>
+            </w:pPr>
+            <w:r>
+              <w:t xml:space="preserve">☐</w:t>
+            </w:r>
+          </w:p>
+        </w:tc>
+        <w:tc>
+          <w:tcPr/>
+          <w:p>
+            <w:pPr>
+              <w:pStyle w:val="Compact"/>
+              <w:jc w:val="center"/>
+            </w:pPr>
+            <w:r>
+              <w:t xml:space="preserve">☐</w:t>
+            </w:r>
+          </w:p>
+        </w:tc>
+        <w:tc>
+          <w:tcPr/>
+          <w:p>
+            <w:pPr>
+              <w:pStyle w:val="Compact"/>
+              <w:jc w:val="center"/>
+            </w:pPr>
+            <w:r>
+              <w:t xml:space="preserve">☐</w:t>
+            </w:r>
           </w:p>
         </w:tc>
       </w:tr>
@@ -389,48 +408,68 @@
               <w:pStyle w:val="Compact"/>
             </w:pPr>
             <w:r>
-              <w:t xml:space="preserve">2. The colour-coded severity indicators are easy to interpret.</w:t>
-            </w:r>
-          </w:p>
-        </w:tc>
-        <w:tc>
-          <w:tcPr/>
-          <w:p>
-            <w:pPr>
-              <w:pStyle w:val="Compact"/>
-            </w:pPr>
-          </w:p>
-        </w:tc>
-        <w:tc>
-          <w:tcPr/>
-          <w:p>
-            <w:pPr>
-              <w:pStyle w:val="Compact"/>
-            </w:pPr>
-          </w:p>
-        </w:tc>
-        <w:tc>
-          <w:tcPr/>
-          <w:p>
-            <w:pPr>
-              <w:pStyle w:val="Compact"/>
-            </w:pPr>
-          </w:p>
-        </w:tc>
-        <w:tc>
-          <w:tcPr/>
-          <w:p>
-            <w:pPr>
-              <w:pStyle w:val="Compact"/>
-            </w:pPr>
-          </w:p>
-        </w:tc>
-        <w:tc>
-          <w:tcPr/>
-          <w:p>
-            <w:pPr>
-              <w:pStyle w:val="Compact"/>
-            </w:pPr>
+              <w:t xml:space="preserve">• Machine learning-based vulnerability prioritisation</w:t>
+            </w:r>
+          </w:p>
+        </w:tc>
+        <w:tc>
+          <w:tcPr/>
+          <w:p>
+            <w:pPr>
+              <w:pStyle w:val="Compact"/>
+              <w:jc w:val="center"/>
+            </w:pPr>
+            <w:r>
+              <w:t xml:space="preserve">☐</w:t>
+            </w:r>
+          </w:p>
+        </w:tc>
+        <w:tc>
+          <w:tcPr/>
+          <w:p>
+            <w:pPr>
+              <w:pStyle w:val="Compact"/>
+              <w:jc w:val="center"/>
+            </w:pPr>
+            <w:r>
+              <w:t xml:space="preserve">☐</w:t>
+            </w:r>
+          </w:p>
+        </w:tc>
+        <w:tc>
+          <w:tcPr/>
+          <w:p>
+            <w:pPr>
+              <w:pStyle w:val="Compact"/>
+              <w:jc w:val="center"/>
+            </w:pPr>
+            <w:r>
+              <w:t xml:space="preserve">☐</w:t>
+            </w:r>
+          </w:p>
+        </w:tc>
+        <w:tc>
+          <w:tcPr/>
+          <w:p>
+            <w:pPr>
+              <w:pStyle w:val="Compact"/>
+              <w:jc w:val="center"/>
+            </w:pPr>
+            <w:r>
+              <w:t xml:space="preserve">☐</w:t>
+            </w:r>
+          </w:p>
+        </w:tc>
+        <w:tc>
+          <w:tcPr/>
+          <w:p>
+            <w:pPr>
+              <w:pStyle w:val="Compact"/>
+              <w:jc w:val="center"/>
+            </w:pPr>
+            <w:r>
+              <w:t xml:space="preserve">☐</w:t>
+            </w:r>
           </w:p>
         </w:tc>
       </w:tr>
@@ -442,48 +481,68 @@
               <w:pStyle w:val="Compact"/>
             </w:pPr>
             <w:r>
-              <w:t xml:space="preserve">3. Navigation between Upload, Findings and Reports is intuitive.</w:t>
-            </w:r>
-          </w:p>
-        </w:tc>
-        <w:tc>
-          <w:tcPr/>
-          <w:p>
-            <w:pPr>
-              <w:pStyle w:val="Compact"/>
-            </w:pPr>
-          </w:p>
-        </w:tc>
-        <w:tc>
-          <w:tcPr/>
-          <w:p>
-            <w:pPr>
-              <w:pStyle w:val="Compact"/>
-            </w:pPr>
-          </w:p>
-        </w:tc>
-        <w:tc>
-          <w:tcPr/>
-          <w:p>
-            <w:pPr>
-              <w:pStyle w:val="Compact"/>
-            </w:pPr>
-          </w:p>
-        </w:tc>
-        <w:tc>
-          <w:tcPr/>
-          <w:p>
-            <w:pPr>
-              <w:pStyle w:val="Compact"/>
-            </w:pPr>
-          </w:p>
-        </w:tc>
-        <w:tc>
-          <w:tcPr/>
-          <w:p>
-            <w:pPr>
-              <w:pStyle w:val="Compact"/>
-            </w:pPr>
+              <w:t xml:space="preserve">• Confidence scoring and false-positive reduction</w:t>
+            </w:r>
+          </w:p>
+        </w:tc>
+        <w:tc>
+          <w:tcPr/>
+          <w:p>
+            <w:pPr>
+              <w:pStyle w:val="Compact"/>
+              <w:jc w:val="center"/>
+            </w:pPr>
+            <w:r>
+              <w:t xml:space="preserve">☐</w:t>
+            </w:r>
+          </w:p>
+        </w:tc>
+        <w:tc>
+          <w:tcPr/>
+          <w:p>
+            <w:pPr>
+              <w:pStyle w:val="Compact"/>
+              <w:jc w:val="center"/>
+            </w:pPr>
+            <w:r>
+              <w:t xml:space="preserve">☐</w:t>
+            </w:r>
+          </w:p>
+        </w:tc>
+        <w:tc>
+          <w:tcPr/>
+          <w:p>
+            <w:pPr>
+              <w:pStyle w:val="Compact"/>
+              <w:jc w:val="center"/>
+            </w:pPr>
+            <w:r>
+              <w:t xml:space="preserve">☐</w:t>
+            </w:r>
+          </w:p>
+        </w:tc>
+        <w:tc>
+          <w:tcPr/>
+          <w:p>
+            <w:pPr>
+              <w:pStyle w:val="Compact"/>
+              <w:jc w:val="center"/>
+            </w:pPr>
+            <w:r>
+              <w:t xml:space="preserve">☐</w:t>
+            </w:r>
+          </w:p>
+        </w:tc>
+        <w:tc>
+          <w:tcPr/>
+          <w:p>
+            <w:pPr>
+              <w:pStyle w:val="Compact"/>
+              <w:jc w:val="center"/>
+            </w:pPr>
+            <w:r>
+              <w:t xml:space="preserve">☐</w:t>
+            </w:r>
           </w:p>
         </w:tc>
       </w:tr>
@@ -495,48 +554,68 @@
               <w:pStyle w:val="Compact"/>
             </w:pPr>
             <w:r>
-              <w:t xml:space="preserve">4. The charts and KPI cards present the triage summary clearly.</w:t>
-            </w:r>
-          </w:p>
-        </w:tc>
-        <w:tc>
-          <w:tcPr/>
-          <w:p>
-            <w:pPr>
-              <w:pStyle w:val="Compact"/>
-            </w:pPr>
-          </w:p>
-        </w:tc>
-        <w:tc>
-          <w:tcPr/>
-          <w:p>
-            <w:pPr>
-              <w:pStyle w:val="Compact"/>
-            </w:pPr>
-          </w:p>
-        </w:tc>
-        <w:tc>
-          <w:tcPr/>
-          <w:p>
-            <w:pPr>
-              <w:pStyle w:val="Compact"/>
-            </w:pPr>
-          </w:p>
-        </w:tc>
-        <w:tc>
-          <w:tcPr/>
-          <w:p>
-            <w:pPr>
-              <w:pStyle w:val="Compact"/>
-            </w:pPr>
-          </w:p>
-        </w:tc>
-        <w:tc>
-          <w:tcPr/>
-          <w:p>
-            <w:pPr>
-              <w:pStyle w:val="Compact"/>
-            </w:pPr>
+              <w:t xml:space="preserve">• Proof-of-Concept validation of vulnerabilities</w:t>
+            </w:r>
+          </w:p>
+        </w:tc>
+        <w:tc>
+          <w:tcPr/>
+          <w:p>
+            <w:pPr>
+              <w:pStyle w:val="Compact"/>
+              <w:jc w:val="center"/>
+            </w:pPr>
+            <w:r>
+              <w:t xml:space="preserve">☐</w:t>
+            </w:r>
+          </w:p>
+        </w:tc>
+        <w:tc>
+          <w:tcPr/>
+          <w:p>
+            <w:pPr>
+              <w:pStyle w:val="Compact"/>
+              <w:jc w:val="center"/>
+            </w:pPr>
+            <w:r>
+              <w:t xml:space="preserve">☐</w:t>
+            </w:r>
+          </w:p>
+        </w:tc>
+        <w:tc>
+          <w:tcPr/>
+          <w:p>
+            <w:pPr>
+              <w:pStyle w:val="Compact"/>
+              <w:jc w:val="center"/>
+            </w:pPr>
+            <w:r>
+              <w:t xml:space="preserve">☐</w:t>
+            </w:r>
+          </w:p>
+        </w:tc>
+        <w:tc>
+          <w:tcPr/>
+          <w:p>
+            <w:pPr>
+              <w:pStyle w:val="Compact"/>
+              <w:jc w:val="center"/>
+            </w:pPr>
+            <w:r>
+              <w:t xml:space="preserve">☐</w:t>
+            </w:r>
+          </w:p>
+        </w:tc>
+        <w:tc>
+          <w:tcPr/>
+          <w:p>
+            <w:pPr>
+              <w:pStyle w:val="Compact"/>
+              <w:jc w:val="center"/>
+            </w:pPr>
+            <w:r>
+              <w:t xml:space="preserve">☐</w:t>
+            </w:r>
           </w:p>
         </w:tc>
       </w:tr>
@@ -548,48 +627,68 @@
               <w:pStyle w:val="Compact"/>
             </w:pPr>
             <w:r>
-              <w:t xml:space="preserve">5. The finding-detail view is readable and well-structured.</w:t>
-            </w:r>
-          </w:p>
-        </w:tc>
-        <w:tc>
-          <w:tcPr/>
-          <w:p>
-            <w:pPr>
-              <w:pStyle w:val="Compact"/>
-            </w:pPr>
-          </w:p>
-        </w:tc>
-        <w:tc>
-          <w:tcPr/>
-          <w:p>
-            <w:pPr>
-              <w:pStyle w:val="Compact"/>
-            </w:pPr>
-          </w:p>
-        </w:tc>
-        <w:tc>
-          <w:tcPr/>
-          <w:p>
-            <w:pPr>
-              <w:pStyle w:val="Compact"/>
-            </w:pPr>
-          </w:p>
-        </w:tc>
-        <w:tc>
-          <w:tcPr/>
-          <w:p>
-            <w:pPr>
-              <w:pStyle w:val="Compact"/>
-            </w:pPr>
-          </w:p>
-        </w:tc>
-        <w:tc>
-          <w:tcPr/>
-          <w:p>
-            <w:pPr>
-              <w:pStyle w:val="Compact"/>
-            </w:pPr>
+              <w:t xml:space="preserve">• AI-assisted vulnerability analysis and recommendations</w:t>
+            </w:r>
+          </w:p>
+        </w:tc>
+        <w:tc>
+          <w:tcPr/>
+          <w:p>
+            <w:pPr>
+              <w:pStyle w:val="Compact"/>
+              <w:jc w:val="center"/>
+            </w:pPr>
+            <w:r>
+              <w:t xml:space="preserve">☐</w:t>
+            </w:r>
+          </w:p>
+        </w:tc>
+        <w:tc>
+          <w:tcPr/>
+          <w:p>
+            <w:pPr>
+              <w:pStyle w:val="Compact"/>
+              <w:jc w:val="center"/>
+            </w:pPr>
+            <w:r>
+              <w:t xml:space="preserve">☐</w:t>
+            </w:r>
+          </w:p>
+        </w:tc>
+        <w:tc>
+          <w:tcPr/>
+          <w:p>
+            <w:pPr>
+              <w:pStyle w:val="Compact"/>
+              <w:jc w:val="center"/>
+            </w:pPr>
+            <w:r>
+              <w:t xml:space="preserve">☐</w:t>
+            </w:r>
+          </w:p>
+        </w:tc>
+        <w:tc>
+          <w:tcPr/>
+          <w:p>
+            <w:pPr>
+              <w:pStyle w:val="Compact"/>
+              <w:jc w:val="center"/>
+            </w:pPr>
+            <w:r>
+              <w:t xml:space="preserve">☐</w:t>
+            </w:r>
+          </w:p>
+        </w:tc>
+        <w:tc>
+          <w:tcPr/>
+          <w:p>
+            <w:pPr>
+              <w:pStyle w:val="Compact"/>
+              <w:jc w:val="center"/>
+            </w:pPr>
+            <w:r>
+              <w:t xml:space="preserve">☐</w:t>
+            </w:r>
           </w:p>
         </w:tc>
       </w:tr>
@@ -601,101 +700,68 @@
               <w:pStyle w:val="Compact"/>
             </w:pPr>
             <w:r>
-              <w:t xml:space="preserve">6. Buttons, forms and controls are obvious and easy to use.</w:t>
-            </w:r>
-          </w:p>
-        </w:tc>
-        <w:tc>
-          <w:tcPr/>
-          <w:p>
-            <w:pPr>
-              <w:pStyle w:val="Compact"/>
-            </w:pPr>
-          </w:p>
-        </w:tc>
-        <w:tc>
-          <w:tcPr/>
-          <w:p>
-            <w:pPr>
-              <w:pStyle w:val="Compact"/>
-            </w:pPr>
-          </w:p>
-        </w:tc>
-        <w:tc>
-          <w:tcPr/>
-          <w:p>
-            <w:pPr>
-              <w:pStyle w:val="Compact"/>
-            </w:pPr>
-          </w:p>
-        </w:tc>
-        <w:tc>
-          <w:tcPr/>
-          <w:p>
-            <w:pPr>
-              <w:pStyle w:val="Compact"/>
-            </w:pPr>
-          </w:p>
-        </w:tc>
-        <w:tc>
-          <w:tcPr/>
-          <w:p>
-            <w:pPr>
-              <w:pStyle w:val="Compact"/>
-            </w:pPr>
-          </w:p>
-        </w:tc>
-      </w:tr>
-      <w:tr>
-        <w:tc>
-          <w:tcPr/>
-          <w:p>
-            <w:pPr>
-              <w:pStyle w:val="Compact"/>
-            </w:pPr>
-            <w:r>
-              <w:t xml:space="preserve">7. The overall look and feel is professional.</w:t>
-            </w:r>
-          </w:p>
-        </w:tc>
-        <w:tc>
-          <w:tcPr/>
-          <w:p>
-            <w:pPr>
-              <w:pStyle w:val="Compact"/>
-            </w:pPr>
-          </w:p>
-        </w:tc>
-        <w:tc>
-          <w:tcPr/>
-          <w:p>
-            <w:pPr>
-              <w:pStyle w:val="Compact"/>
-            </w:pPr>
-          </w:p>
-        </w:tc>
-        <w:tc>
-          <w:tcPr/>
-          <w:p>
-            <w:pPr>
-              <w:pStyle w:val="Compact"/>
-            </w:pPr>
-          </w:p>
-        </w:tc>
-        <w:tc>
-          <w:tcPr/>
-          <w:p>
-            <w:pPr>
-              <w:pStyle w:val="Compact"/>
-            </w:pPr>
-          </w:p>
-        </w:tc>
-        <w:tc>
-          <w:tcPr/>
-          <w:p>
-            <w:pPr>
-              <w:pStyle w:val="Compact"/>
-            </w:pPr>
+              <w:t xml:space="preserve">• Professional PDF report generation</w:t>
+            </w:r>
+          </w:p>
+        </w:tc>
+        <w:tc>
+          <w:tcPr/>
+          <w:p>
+            <w:pPr>
+              <w:pStyle w:val="Compact"/>
+              <w:jc w:val="center"/>
+            </w:pPr>
+            <w:r>
+              <w:t xml:space="preserve">☐</w:t>
+            </w:r>
+          </w:p>
+        </w:tc>
+        <w:tc>
+          <w:tcPr/>
+          <w:p>
+            <w:pPr>
+              <w:pStyle w:val="Compact"/>
+              <w:jc w:val="center"/>
+            </w:pPr>
+            <w:r>
+              <w:t xml:space="preserve">☐</w:t>
+            </w:r>
+          </w:p>
+        </w:tc>
+        <w:tc>
+          <w:tcPr/>
+          <w:p>
+            <w:pPr>
+              <w:pStyle w:val="Compact"/>
+              <w:jc w:val="center"/>
+            </w:pPr>
+            <w:r>
+              <w:t xml:space="preserve">☐</w:t>
+            </w:r>
+          </w:p>
+        </w:tc>
+        <w:tc>
+          <w:tcPr/>
+          <w:p>
+            <w:pPr>
+              <w:pStyle w:val="Compact"/>
+              <w:jc w:val="center"/>
+            </w:pPr>
+            <w:r>
+              <w:t xml:space="preserve">☐</w:t>
+            </w:r>
+          </w:p>
+        </w:tc>
+        <w:tc>
+          <w:tcPr/>
+          <w:p>
+            <w:pPr>
+              <w:pStyle w:val="Compact"/>
+              <w:jc w:val="center"/>
+            </w:pPr>
+            <w:r>
+              <w:t xml:space="preserve">☐</w:t>
+            </w:r>
           </w:p>
         </w:tc>
       </w:tr>
@@ -711,7 +777,7 @@
                 <w:b/>
                 <w:bCs/>
               </w:rPr>
-              <w:t xml:space="preserve">B · FUNCTIONALITY</w:t>
+              <w:t xml:space="preserve">User Interface</w:t>
             </w:r>
           </w:p>
         </w:tc>
@@ -764,48 +830,68 @@
               <w:pStyle w:val="Compact"/>
             </w:pPr>
             <w:r>
-              <w:t xml:space="preserve">8. Registering an account and logging in worked without error.</w:t>
-            </w:r>
-          </w:p>
-        </w:tc>
-        <w:tc>
-          <w:tcPr/>
-          <w:p>
-            <w:pPr>
-              <w:pStyle w:val="Compact"/>
-            </w:pPr>
-          </w:p>
-        </w:tc>
-        <w:tc>
-          <w:tcPr/>
-          <w:p>
-            <w:pPr>
-              <w:pStyle w:val="Compact"/>
-            </w:pPr>
-          </w:p>
-        </w:tc>
-        <w:tc>
-          <w:tcPr/>
-          <w:p>
-            <w:pPr>
-              <w:pStyle w:val="Compact"/>
-            </w:pPr>
-          </w:p>
-        </w:tc>
-        <w:tc>
-          <w:tcPr/>
-          <w:p>
-            <w:pPr>
-              <w:pStyle w:val="Compact"/>
-            </w:pPr>
-          </w:p>
-        </w:tc>
-        <w:tc>
-          <w:tcPr/>
-          <w:p>
-            <w:pPr>
-              <w:pStyle w:val="Compact"/>
-            </w:pPr>
+              <w:t xml:space="preserve">• Dashboard is easy to understand</w:t>
+            </w:r>
+          </w:p>
+        </w:tc>
+        <w:tc>
+          <w:tcPr/>
+          <w:p>
+            <w:pPr>
+              <w:pStyle w:val="Compact"/>
+              <w:jc w:val="center"/>
+            </w:pPr>
+            <w:r>
+              <w:t xml:space="preserve">☐</w:t>
+            </w:r>
+          </w:p>
+        </w:tc>
+        <w:tc>
+          <w:tcPr/>
+          <w:p>
+            <w:pPr>
+              <w:pStyle w:val="Compact"/>
+              <w:jc w:val="center"/>
+            </w:pPr>
+            <w:r>
+              <w:t xml:space="preserve">☐</w:t>
+            </w:r>
+          </w:p>
+        </w:tc>
+        <w:tc>
+          <w:tcPr/>
+          <w:p>
+            <w:pPr>
+              <w:pStyle w:val="Compact"/>
+              <w:jc w:val="center"/>
+            </w:pPr>
+            <w:r>
+              <w:t xml:space="preserve">☐</w:t>
+            </w:r>
+          </w:p>
+        </w:tc>
+        <w:tc>
+          <w:tcPr/>
+          <w:p>
+            <w:pPr>
+              <w:pStyle w:val="Compact"/>
+              <w:jc w:val="center"/>
+            </w:pPr>
+            <w:r>
+              <w:t xml:space="preserve">☐</w:t>
+            </w:r>
+          </w:p>
+        </w:tc>
+        <w:tc>
+          <w:tcPr/>
+          <w:p>
+            <w:pPr>
+              <w:pStyle w:val="Compact"/>
+              <w:jc w:val="center"/>
+            </w:pPr>
+            <w:r>
+              <w:t xml:space="preserve">☐</w:t>
+            </w:r>
           </w:p>
         </w:tc>
       </w:tr>
@@ -817,48 +903,68 @@
               <w:pStyle w:val="Compact"/>
             </w:pPr>
             <w:r>
-              <w:t xml:space="preserve">9. Uploading a scanner report (ZAP / Nuclei / Nessus) and running the triage worked without error.</w:t>
-            </w:r>
-          </w:p>
-        </w:tc>
-        <w:tc>
-          <w:tcPr/>
-          <w:p>
-            <w:pPr>
-              <w:pStyle w:val="Compact"/>
-            </w:pPr>
-          </w:p>
-        </w:tc>
-        <w:tc>
-          <w:tcPr/>
-          <w:p>
-            <w:pPr>
-              <w:pStyle w:val="Compact"/>
-            </w:pPr>
-          </w:p>
-        </w:tc>
-        <w:tc>
-          <w:tcPr/>
-          <w:p>
-            <w:pPr>
-              <w:pStyle w:val="Compact"/>
-            </w:pPr>
-          </w:p>
-        </w:tc>
-        <w:tc>
-          <w:tcPr/>
-          <w:p>
-            <w:pPr>
-              <w:pStyle w:val="Compact"/>
-            </w:pPr>
-          </w:p>
-        </w:tc>
-        <w:tc>
-          <w:tcPr/>
-          <w:p>
-            <w:pPr>
-              <w:pStyle w:val="Compact"/>
-            </w:pPr>
+              <w:t xml:space="preserve">• Navigation between modules is intuitive</w:t>
+            </w:r>
+          </w:p>
+        </w:tc>
+        <w:tc>
+          <w:tcPr/>
+          <w:p>
+            <w:pPr>
+              <w:pStyle w:val="Compact"/>
+              <w:jc w:val="center"/>
+            </w:pPr>
+            <w:r>
+              <w:t xml:space="preserve">☐</w:t>
+            </w:r>
+          </w:p>
+        </w:tc>
+        <w:tc>
+          <w:tcPr/>
+          <w:p>
+            <w:pPr>
+              <w:pStyle w:val="Compact"/>
+              <w:jc w:val="center"/>
+            </w:pPr>
+            <w:r>
+              <w:t xml:space="preserve">☐</w:t>
+            </w:r>
+          </w:p>
+        </w:tc>
+        <w:tc>
+          <w:tcPr/>
+          <w:p>
+            <w:pPr>
+              <w:pStyle w:val="Compact"/>
+              <w:jc w:val="center"/>
+            </w:pPr>
+            <w:r>
+              <w:t xml:space="preserve">☐</w:t>
+            </w:r>
+          </w:p>
+        </w:tc>
+        <w:tc>
+          <w:tcPr/>
+          <w:p>
+            <w:pPr>
+              <w:pStyle w:val="Compact"/>
+              <w:jc w:val="center"/>
+            </w:pPr>
+            <w:r>
+              <w:t xml:space="preserve">☐</w:t>
+            </w:r>
+          </w:p>
+        </w:tc>
+        <w:tc>
+          <w:tcPr/>
+          <w:p>
+            <w:pPr>
+              <w:pStyle w:val="Compact"/>
+              <w:jc w:val="center"/>
+            </w:pPr>
+            <w:r>
+              <w:t xml:space="preserve">☐</w:t>
+            </w:r>
           </w:p>
         </w:tc>
       </w:tr>
@@ -870,48 +976,68 @@
               <w:pStyle w:val="Compact"/>
             </w:pPr>
             <w:r>
-              <w:t xml:space="preserve">10. Findings were triaged and classified automatically after upload.</w:t>
-            </w:r>
-          </w:p>
-        </w:tc>
-        <w:tc>
-          <w:tcPr/>
-          <w:p>
-            <w:pPr>
-              <w:pStyle w:val="Compact"/>
-            </w:pPr>
-          </w:p>
-        </w:tc>
-        <w:tc>
-          <w:tcPr/>
-          <w:p>
-            <w:pPr>
-              <w:pStyle w:val="Compact"/>
-            </w:pPr>
-          </w:p>
-        </w:tc>
-        <w:tc>
-          <w:tcPr/>
-          <w:p>
-            <w:pPr>
-              <w:pStyle w:val="Compact"/>
-            </w:pPr>
-          </w:p>
-        </w:tc>
-        <w:tc>
-          <w:tcPr/>
-          <w:p>
-            <w:pPr>
-              <w:pStyle w:val="Compact"/>
-            </w:pPr>
-          </w:p>
-        </w:tc>
-        <w:tc>
-          <w:tcPr/>
-          <w:p>
-            <w:pPr>
-              <w:pStyle w:val="Compact"/>
-            </w:pPr>
+              <w:t xml:space="preserve">• Vulnerability information is clearly presented</w:t>
+            </w:r>
+          </w:p>
+        </w:tc>
+        <w:tc>
+          <w:tcPr/>
+          <w:p>
+            <w:pPr>
+              <w:pStyle w:val="Compact"/>
+              <w:jc w:val="center"/>
+            </w:pPr>
+            <w:r>
+              <w:t xml:space="preserve">☐</w:t>
+            </w:r>
+          </w:p>
+        </w:tc>
+        <w:tc>
+          <w:tcPr/>
+          <w:p>
+            <w:pPr>
+              <w:pStyle w:val="Compact"/>
+              <w:jc w:val="center"/>
+            </w:pPr>
+            <w:r>
+              <w:t xml:space="preserve">☐</w:t>
+            </w:r>
+          </w:p>
+        </w:tc>
+        <w:tc>
+          <w:tcPr/>
+          <w:p>
+            <w:pPr>
+              <w:pStyle w:val="Compact"/>
+              <w:jc w:val="center"/>
+            </w:pPr>
+            <w:r>
+              <w:t xml:space="preserve">☐</w:t>
+            </w:r>
+          </w:p>
+        </w:tc>
+        <w:tc>
+          <w:tcPr/>
+          <w:p>
+            <w:pPr>
+              <w:pStyle w:val="Compact"/>
+              <w:jc w:val="center"/>
+            </w:pPr>
+            <w:r>
+              <w:t xml:space="preserve">☐</w:t>
+            </w:r>
+          </w:p>
+        </w:tc>
+        <w:tc>
+          <w:tcPr/>
+          <w:p>
+            <w:pPr>
+              <w:pStyle w:val="Compact"/>
+              <w:jc w:val="center"/>
+            </w:pPr>
+            <w:r>
+              <w:t xml:space="preserve">☐</w:t>
+            </w:r>
           </w:p>
         </w:tc>
       </w:tr>
@@ -923,48 +1049,68 @@
               <w:pStyle w:val="Compact"/>
             </w:pPr>
             <w:r>
-              <w:t xml:space="preserve">11. The system handled invalid input / an unsupported file gracefully.</w:t>
-            </w:r>
-          </w:p>
-        </w:tc>
-        <w:tc>
-          <w:tcPr/>
-          <w:p>
-            <w:pPr>
-              <w:pStyle w:val="Compact"/>
-            </w:pPr>
-          </w:p>
-        </w:tc>
-        <w:tc>
-          <w:tcPr/>
-          <w:p>
-            <w:pPr>
-              <w:pStyle w:val="Compact"/>
-            </w:pPr>
-          </w:p>
-        </w:tc>
-        <w:tc>
-          <w:tcPr/>
-          <w:p>
-            <w:pPr>
-              <w:pStyle w:val="Compact"/>
-            </w:pPr>
-          </w:p>
-        </w:tc>
-        <w:tc>
-          <w:tcPr/>
-          <w:p>
-            <w:pPr>
-              <w:pStyle w:val="Compact"/>
-            </w:pPr>
-          </w:p>
-        </w:tc>
-        <w:tc>
-          <w:tcPr/>
-          <w:p>
-            <w:pPr>
-              <w:pStyle w:val="Compact"/>
-            </w:pPr>
+              <w:t xml:space="preserve">• Charts and visualisations are useful</w:t>
+            </w:r>
+          </w:p>
+        </w:tc>
+        <w:tc>
+          <w:tcPr/>
+          <w:p>
+            <w:pPr>
+              <w:pStyle w:val="Compact"/>
+              <w:jc w:val="center"/>
+            </w:pPr>
+            <w:r>
+              <w:t xml:space="preserve">☐</w:t>
+            </w:r>
+          </w:p>
+        </w:tc>
+        <w:tc>
+          <w:tcPr/>
+          <w:p>
+            <w:pPr>
+              <w:pStyle w:val="Compact"/>
+              <w:jc w:val="center"/>
+            </w:pPr>
+            <w:r>
+              <w:t xml:space="preserve">☐</w:t>
+            </w:r>
+          </w:p>
+        </w:tc>
+        <w:tc>
+          <w:tcPr/>
+          <w:p>
+            <w:pPr>
+              <w:pStyle w:val="Compact"/>
+              <w:jc w:val="center"/>
+            </w:pPr>
+            <w:r>
+              <w:t xml:space="preserve">☐</w:t>
+            </w:r>
+          </w:p>
+        </w:tc>
+        <w:tc>
+          <w:tcPr/>
+          <w:p>
+            <w:pPr>
+              <w:pStyle w:val="Compact"/>
+              <w:jc w:val="center"/>
+            </w:pPr>
+            <w:r>
+              <w:t xml:space="preserve">☐</w:t>
+            </w:r>
+          </w:p>
+        </w:tc>
+        <w:tc>
+          <w:tcPr/>
+          <w:p>
+            <w:pPr>
+              <w:pStyle w:val="Compact"/>
+              <w:jc w:val="center"/>
+            </w:pPr>
+            <w:r>
+              <w:t xml:space="preserve">☐</w:t>
+            </w:r>
           </w:p>
         </w:tc>
       </w:tr>
@@ -976,101 +1122,68 @@
               <w:pStyle w:val="Compact"/>
             </w:pPr>
             <w:r>
-              <w:t xml:space="preserve">12. The Auto Scan authorisation control made the scope and consent clear.</w:t>
-            </w:r>
-          </w:p>
-        </w:tc>
-        <w:tc>
-          <w:tcPr/>
-          <w:p>
-            <w:pPr>
-              <w:pStyle w:val="Compact"/>
-            </w:pPr>
-          </w:p>
-        </w:tc>
-        <w:tc>
-          <w:tcPr/>
-          <w:p>
-            <w:pPr>
-              <w:pStyle w:val="Compact"/>
-            </w:pPr>
-          </w:p>
-        </w:tc>
-        <w:tc>
-          <w:tcPr/>
-          <w:p>
-            <w:pPr>
-              <w:pStyle w:val="Compact"/>
-            </w:pPr>
-          </w:p>
-        </w:tc>
-        <w:tc>
-          <w:tcPr/>
-          <w:p>
-            <w:pPr>
-              <w:pStyle w:val="Compact"/>
-            </w:pPr>
-          </w:p>
-        </w:tc>
-        <w:tc>
-          <w:tcPr/>
-          <w:p>
-            <w:pPr>
-              <w:pStyle w:val="Compact"/>
-            </w:pPr>
-          </w:p>
-        </w:tc>
-      </w:tr>
-      <w:tr>
-        <w:tc>
-          <w:tcPr/>
-          <w:p>
-            <w:pPr>
-              <w:pStyle w:val="Compact"/>
-            </w:pPr>
-            <w:r>
-              <w:t xml:space="preserve">13. The PDF report generated and downloaded successfully.</w:t>
-            </w:r>
-          </w:p>
-        </w:tc>
-        <w:tc>
-          <w:tcPr/>
-          <w:p>
-            <w:pPr>
-              <w:pStyle w:val="Compact"/>
-            </w:pPr>
-          </w:p>
-        </w:tc>
-        <w:tc>
-          <w:tcPr/>
-          <w:p>
-            <w:pPr>
-              <w:pStyle w:val="Compact"/>
-            </w:pPr>
-          </w:p>
-        </w:tc>
-        <w:tc>
-          <w:tcPr/>
-          <w:p>
-            <w:pPr>
-              <w:pStyle w:val="Compact"/>
-            </w:pPr>
-          </w:p>
-        </w:tc>
-        <w:tc>
-          <w:tcPr/>
-          <w:p>
-            <w:pPr>
-              <w:pStyle w:val="Compact"/>
-            </w:pPr>
-          </w:p>
-        </w:tc>
-        <w:tc>
-          <w:tcPr/>
-          <w:p>
-            <w:pPr>
-              <w:pStyle w:val="Compact"/>
-            </w:pPr>
+              <w:t xml:space="preserve">• Finding Details page is informative and easy to understand</w:t>
+            </w:r>
+          </w:p>
+        </w:tc>
+        <w:tc>
+          <w:tcPr/>
+          <w:p>
+            <w:pPr>
+              <w:pStyle w:val="Compact"/>
+              <w:jc w:val="center"/>
+            </w:pPr>
+            <w:r>
+              <w:t xml:space="preserve">☐</w:t>
+            </w:r>
+          </w:p>
+        </w:tc>
+        <w:tc>
+          <w:tcPr/>
+          <w:p>
+            <w:pPr>
+              <w:pStyle w:val="Compact"/>
+              <w:jc w:val="center"/>
+            </w:pPr>
+            <w:r>
+              <w:t xml:space="preserve">☐</w:t>
+            </w:r>
+          </w:p>
+        </w:tc>
+        <w:tc>
+          <w:tcPr/>
+          <w:p>
+            <w:pPr>
+              <w:pStyle w:val="Compact"/>
+              <w:jc w:val="center"/>
+            </w:pPr>
+            <w:r>
+              <w:t xml:space="preserve">☐</w:t>
+            </w:r>
+          </w:p>
+        </w:tc>
+        <w:tc>
+          <w:tcPr/>
+          <w:p>
+            <w:pPr>
+              <w:pStyle w:val="Compact"/>
+              <w:jc w:val="center"/>
+            </w:pPr>
+            <w:r>
+              <w:t xml:space="preserve">☐</w:t>
+            </w:r>
+          </w:p>
+        </w:tc>
+        <w:tc>
+          <w:tcPr/>
+          <w:p>
+            <w:pPr>
+              <w:pStyle w:val="Compact"/>
+              <w:jc w:val="center"/>
+            </w:pPr>
+            <w:r>
+              <w:t xml:space="preserve">☐</w:t>
+            </w:r>
           </w:p>
         </w:tc>
       </w:tr>
@@ -1086,7 +1199,7 @@
                 <w:b/>
                 <w:bCs/>
               </w:rPr>
-              <w:t xml:space="preserve">C · TRIAGE VALUE (the system's core purpose)</w:t>
+              <w:t xml:space="preserve">User Experience</w:t>
             </w:r>
           </w:p>
         </w:tc>
@@ -1139,48 +1252,68 @@
               <w:pStyle w:val="Compact"/>
             </w:pPr>
             <w:r>
-              <w:t xml:space="preserve">14. The confidence score and rationale helped me judge whether a finding is real.</w:t>
-            </w:r>
-          </w:p>
-        </w:tc>
-        <w:tc>
-          <w:tcPr/>
-          <w:p>
-            <w:pPr>
-              <w:pStyle w:val="Compact"/>
-            </w:pPr>
-          </w:p>
-        </w:tc>
-        <w:tc>
-          <w:tcPr/>
-          <w:p>
-            <w:pPr>
-              <w:pStyle w:val="Compact"/>
-            </w:pPr>
-          </w:p>
-        </w:tc>
-        <w:tc>
-          <w:tcPr/>
-          <w:p>
-            <w:pPr>
-              <w:pStyle w:val="Compact"/>
-            </w:pPr>
-          </w:p>
-        </w:tc>
-        <w:tc>
-          <w:tcPr/>
-          <w:p>
-            <w:pPr>
-              <w:pStyle w:val="Compact"/>
-            </w:pPr>
-          </w:p>
-        </w:tc>
-        <w:tc>
-          <w:tcPr/>
-          <w:p>
-            <w:pPr>
-              <w:pStyle w:val="Compact"/>
-            </w:pPr>
+              <w:t xml:space="preserve">• Uploading scanner reports is straightforward</w:t>
+            </w:r>
+          </w:p>
+        </w:tc>
+        <w:tc>
+          <w:tcPr/>
+          <w:p>
+            <w:pPr>
+              <w:pStyle w:val="Compact"/>
+              <w:jc w:val="center"/>
+            </w:pPr>
+            <w:r>
+              <w:t xml:space="preserve">☐</w:t>
+            </w:r>
+          </w:p>
+        </w:tc>
+        <w:tc>
+          <w:tcPr/>
+          <w:p>
+            <w:pPr>
+              <w:pStyle w:val="Compact"/>
+              <w:jc w:val="center"/>
+            </w:pPr>
+            <w:r>
+              <w:t xml:space="preserve">☐</w:t>
+            </w:r>
+          </w:p>
+        </w:tc>
+        <w:tc>
+          <w:tcPr/>
+          <w:p>
+            <w:pPr>
+              <w:pStyle w:val="Compact"/>
+              <w:jc w:val="center"/>
+            </w:pPr>
+            <w:r>
+              <w:t xml:space="preserve">☐</w:t>
+            </w:r>
+          </w:p>
+        </w:tc>
+        <w:tc>
+          <w:tcPr/>
+          <w:p>
+            <w:pPr>
+              <w:pStyle w:val="Compact"/>
+              <w:jc w:val="center"/>
+            </w:pPr>
+            <w:r>
+              <w:t xml:space="preserve">☐</w:t>
+            </w:r>
+          </w:p>
+        </w:tc>
+        <w:tc>
+          <w:tcPr/>
+          <w:p>
+            <w:pPr>
+              <w:pStyle w:val="Compact"/>
+              <w:jc w:val="center"/>
+            </w:pPr>
+            <w:r>
+              <w:t xml:space="preserve">☐</w:t>
+            </w:r>
           </w:p>
         </w:tc>
       </w:tr>
@@ -1192,48 +1325,68 @@
               <w:pStyle w:val="Compact"/>
             </w:pPr>
             <w:r>
-              <w:t xml:space="preserve">15. The Confirmed / Needs-Verification / Not-Confirmed classification is clear and useful.</w:t>
-            </w:r>
-          </w:p>
-        </w:tc>
-        <w:tc>
-          <w:tcPr/>
-          <w:p>
-            <w:pPr>
-              <w:pStyle w:val="Compact"/>
-            </w:pPr>
-          </w:p>
-        </w:tc>
-        <w:tc>
-          <w:tcPr/>
-          <w:p>
-            <w:pPr>
-              <w:pStyle w:val="Compact"/>
-            </w:pPr>
-          </w:p>
-        </w:tc>
-        <w:tc>
-          <w:tcPr/>
-          <w:p>
-            <w:pPr>
-              <w:pStyle w:val="Compact"/>
-            </w:pPr>
-          </w:p>
-        </w:tc>
-        <w:tc>
-          <w:tcPr/>
-          <w:p>
-            <w:pPr>
-              <w:pStyle w:val="Compact"/>
-            </w:pPr>
-          </w:p>
-        </w:tc>
-        <w:tc>
-          <w:tcPr/>
-          <w:p>
-            <w:pPr>
-              <w:pStyle w:val="Compact"/>
-            </w:pPr>
+              <w:t xml:space="preserve">• Running the vulnerability triage pipeline is simple</w:t>
+            </w:r>
+          </w:p>
+        </w:tc>
+        <w:tc>
+          <w:tcPr/>
+          <w:p>
+            <w:pPr>
+              <w:pStyle w:val="Compact"/>
+              <w:jc w:val="center"/>
+            </w:pPr>
+            <w:r>
+              <w:t xml:space="preserve">☐</w:t>
+            </w:r>
+          </w:p>
+        </w:tc>
+        <w:tc>
+          <w:tcPr/>
+          <w:p>
+            <w:pPr>
+              <w:pStyle w:val="Compact"/>
+              <w:jc w:val="center"/>
+            </w:pPr>
+            <w:r>
+              <w:t xml:space="preserve">☐</w:t>
+            </w:r>
+          </w:p>
+        </w:tc>
+        <w:tc>
+          <w:tcPr/>
+          <w:p>
+            <w:pPr>
+              <w:pStyle w:val="Compact"/>
+              <w:jc w:val="center"/>
+            </w:pPr>
+            <w:r>
+              <w:t xml:space="preserve">☐</w:t>
+            </w:r>
+          </w:p>
+        </w:tc>
+        <w:tc>
+          <w:tcPr/>
+          <w:p>
+            <w:pPr>
+              <w:pStyle w:val="Compact"/>
+              <w:jc w:val="center"/>
+            </w:pPr>
+            <w:r>
+              <w:t xml:space="preserve">☐</w:t>
+            </w:r>
+          </w:p>
+        </w:tc>
+        <w:tc>
+          <w:tcPr/>
+          <w:p>
+            <w:pPr>
+              <w:pStyle w:val="Compact"/>
+              <w:jc w:val="center"/>
+            </w:pPr>
+            <w:r>
+              <w:t xml:space="preserve">☐</w:t>
+            </w:r>
           </w:p>
         </w:tc>
       </w:tr>
@@ -1245,48 +1398,68 @@
               <w:pStyle w:val="Compact"/>
             </w:pPr>
             <w:r>
-              <w:t xml:space="preserve">16. The AI-assisted analysis (risk explanation and suggested fix) helped me understand the vulnerability.</w:t>
-            </w:r>
-          </w:p>
-        </w:tc>
-        <w:tc>
-          <w:tcPr/>
-          <w:p>
-            <w:pPr>
-              <w:pStyle w:val="Compact"/>
-            </w:pPr>
-          </w:p>
-        </w:tc>
-        <w:tc>
-          <w:tcPr/>
-          <w:p>
-            <w:pPr>
-              <w:pStyle w:val="Compact"/>
-            </w:pPr>
-          </w:p>
-        </w:tc>
-        <w:tc>
-          <w:tcPr/>
-          <w:p>
-            <w:pPr>
-              <w:pStyle w:val="Compact"/>
-            </w:pPr>
-          </w:p>
-        </w:tc>
-        <w:tc>
-          <w:tcPr/>
-          <w:p>
-            <w:pPr>
-              <w:pStyle w:val="Compact"/>
-            </w:pPr>
-          </w:p>
-        </w:tc>
-        <w:tc>
-          <w:tcPr/>
-          <w:p>
-            <w:pPr>
-              <w:pStyle w:val="Compact"/>
-            </w:pPr>
+              <w:t xml:space="preserve">• Auto Scan is easy to configure and execute</w:t>
+            </w:r>
+          </w:p>
+        </w:tc>
+        <w:tc>
+          <w:tcPr/>
+          <w:p>
+            <w:pPr>
+              <w:pStyle w:val="Compact"/>
+              <w:jc w:val="center"/>
+            </w:pPr>
+            <w:r>
+              <w:t xml:space="preserve">☐</w:t>
+            </w:r>
+          </w:p>
+        </w:tc>
+        <w:tc>
+          <w:tcPr/>
+          <w:p>
+            <w:pPr>
+              <w:pStyle w:val="Compact"/>
+              <w:jc w:val="center"/>
+            </w:pPr>
+            <w:r>
+              <w:t xml:space="preserve">☐</w:t>
+            </w:r>
+          </w:p>
+        </w:tc>
+        <w:tc>
+          <w:tcPr/>
+          <w:p>
+            <w:pPr>
+              <w:pStyle w:val="Compact"/>
+              <w:jc w:val="center"/>
+            </w:pPr>
+            <w:r>
+              <w:t xml:space="preserve">☐</w:t>
+            </w:r>
+          </w:p>
+        </w:tc>
+        <w:tc>
+          <w:tcPr/>
+          <w:p>
+            <w:pPr>
+              <w:pStyle w:val="Compact"/>
+              <w:jc w:val="center"/>
+            </w:pPr>
+            <w:r>
+              <w:t xml:space="preserve">☐</w:t>
+            </w:r>
+          </w:p>
+        </w:tc>
+        <w:tc>
+          <w:tcPr/>
+          <w:p>
+            <w:pPr>
+              <w:pStyle w:val="Compact"/>
+              <w:jc w:val="center"/>
+            </w:pPr>
+            <w:r>
+              <w:t xml:space="preserve">☐</w:t>
+            </w:r>
           </w:p>
         </w:tc>
       </w:tr>
@@ -1298,48 +1471,68 @@
               <w:pStyle w:val="Compact"/>
             </w:pPr>
             <w:r>
-              <w:t xml:space="preserve">17. Deduplication correctly merged the same finding reported by multiple scanners.</w:t>
-            </w:r>
-          </w:p>
-        </w:tc>
-        <w:tc>
-          <w:tcPr/>
-          <w:p>
-            <w:pPr>
-              <w:pStyle w:val="Compact"/>
-            </w:pPr>
-          </w:p>
-        </w:tc>
-        <w:tc>
-          <w:tcPr/>
-          <w:p>
-            <w:pPr>
-              <w:pStyle w:val="Compact"/>
-            </w:pPr>
-          </w:p>
-        </w:tc>
-        <w:tc>
-          <w:tcPr/>
-          <w:p>
-            <w:pPr>
-              <w:pStyle w:val="Compact"/>
-            </w:pPr>
-          </w:p>
-        </w:tc>
-        <w:tc>
-          <w:tcPr/>
-          <w:p>
-            <w:pPr>
-              <w:pStyle w:val="Compact"/>
-            </w:pPr>
-          </w:p>
-        </w:tc>
-        <w:tc>
-          <w:tcPr/>
-          <w:p>
-            <w:pPr>
-              <w:pStyle w:val="Compact"/>
-            </w:pPr>
+              <w:t xml:space="preserve">• AI-assisted report generation is easy to use</w:t>
+            </w:r>
+          </w:p>
+        </w:tc>
+        <w:tc>
+          <w:tcPr/>
+          <w:p>
+            <w:pPr>
+              <w:pStyle w:val="Compact"/>
+              <w:jc w:val="center"/>
+            </w:pPr>
+            <w:r>
+              <w:t xml:space="preserve">☐</w:t>
+            </w:r>
+          </w:p>
+        </w:tc>
+        <w:tc>
+          <w:tcPr/>
+          <w:p>
+            <w:pPr>
+              <w:pStyle w:val="Compact"/>
+              <w:jc w:val="center"/>
+            </w:pPr>
+            <w:r>
+              <w:t xml:space="preserve">☐</w:t>
+            </w:r>
+          </w:p>
+        </w:tc>
+        <w:tc>
+          <w:tcPr/>
+          <w:p>
+            <w:pPr>
+              <w:pStyle w:val="Compact"/>
+              <w:jc w:val="center"/>
+            </w:pPr>
+            <w:r>
+              <w:t xml:space="preserve">☐</w:t>
+            </w:r>
+          </w:p>
+        </w:tc>
+        <w:tc>
+          <w:tcPr/>
+          <w:p>
+            <w:pPr>
+              <w:pStyle w:val="Compact"/>
+              <w:jc w:val="center"/>
+            </w:pPr>
+            <w:r>
+              <w:t xml:space="preserve">☐</w:t>
+            </w:r>
+          </w:p>
+        </w:tc>
+        <w:tc>
+          <w:tcPr/>
+          <w:p>
+            <w:pPr>
+              <w:pStyle w:val="Compact"/>
+              <w:jc w:val="center"/>
+            </w:pPr>
+            <w:r>
+              <w:t xml:space="preserve">☐</w:t>
+            </w:r>
           </w:p>
         </w:tc>
       </w:tr>
@@ -1351,101 +1544,68 @@
               <w:pStyle w:val="Compact"/>
             </w:pPr>
             <w:r>
-              <w:t xml:space="preserve">18. The generated report is suitable to hand to a stakeholder.</w:t>
-            </w:r>
-          </w:p>
-        </w:tc>
-        <w:tc>
-          <w:tcPr/>
-          <w:p>
-            <w:pPr>
-              <w:pStyle w:val="Compact"/>
-            </w:pPr>
-          </w:p>
-        </w:tc>
-        <w:tc>
-          <w:tcPr/>
-          <w:p>
-            <w:pPr>
-              <w:pStyle w:val="Compact"/>
-            </w:pPr>
-          </w:p>
-        </w:tc>
-        <w:tc>
-          <w:tcPr/>
-          <w:p>
-            <w:pPr>
-              <w:pStyle w:val="Compact"/>
-            </w:pPr>
-          </w:p>
-        </w:tc>
-        <w:tc>
-          <w:tcPr/>
-          <w:p>
-            <w:pPr>
-              <w:pStyle w:val="Compact"/>
-            </w:pPr>
-          </w:p>
-        </w:tc>
-        <w:tc>
-          <w:tcPr/>
-          <w:p>
-            <w:pPr>
-              <w:pStyle w:val="Compact"/>
-            </w:pPr>
-          </w:p>
-        </w:tc>
-      </w:tr>
-      <w:tr>
-        <w:tc>
-          <w:tcPr/>
-          <w:p>
-            <w:pPr>
-              <w:pStyle w:val="Compact"/>
-            </w:pPr>
-            <w:r>
-              <w:t xml:space="preserve">19. Overall, the system reduces the manual effort of triaging scanner output.</w:t>
-            </w:r>
-          </w:p>
-        </w:tc>
-        <w:tc>
-          <w:tcPr/>
-          <w:p>
-            <w:pPr>
-              <w:pStyle w:val="Compact"/>
-            </w:pPr>
-          </w:p>
-        </w:tc>
-        <w:tc>
-          <w:tcPr/>
-          <w:p>
-            <w:pPr>
-              <w:pStyle w:val="Compact"/>
-            </w:pPr>
-          </w:p>
-        </w:tc>
-        <w:tc>
-          <w:tcPr/>
-          <w:p>
-            <w:pPr>
-              <w:pStyle w:val="Compact"/>
-            </w:pPr>
-          </w:p>
-        </w:tc>
-        <w:tc>
-          <w:tcPr/>
-          <w:p>
-            <w:pPr>
-              <w:pStyle w:val="Compact"/>
-            </w:pPr>
-          </w:p>
-        </w:tc>
-        <w:tc>
-          <w:tcPr/>
-          <w:p>
-            <w:pPr>
-              <w:pStyle w:val="Compact"/>
-            </w:pPr>
+              <w:t xml:space="preserve">• PDF report generation is fast and straightforward</w:t>
+            </w:r>
+          </w:p>
+        </w:tc>
+        <w:tc>
+          <w:tcPr/>
+          <w:p>
+            <w:pPr>
+              <w:pStyle w:val="Compact"/>
+              <w:jc w:val="center"/>
+            </w:pPr>
+            <w:r>
+              <w:t xml:space="preserve">☐</w:t>
+            </w:r>
+          </w:p>
+        </w:tc>
+        <w:tc>
+          <w:tcPr/>
+          <w:p>
+            <w:pPr>
+              <w:pStyle w:val="Compact"/>
+              <w:jc w:val="center"/>
+            </w:pPr>
+            <w:r>
+              <w:t xml:space="preserve">☐</w:t>
+            </w:r>
+          </w:p>
+        </w:tc>
+        <w:tc>
+          <w:tcPr/>
+          <w:p>
+            <w:pPr>
+              <w:pStyle w:val="Compact"/>
+              <w:jc w:val="center"/>
+            </w:pPr>
+            <w:r>
+              <w:t xml:space="preserve">☐</w:t>
+            </w:r>
+          </w:p>
+        </w:tc>
+        <w:tc>
+          <w:tcPr/>
+          <w:p>
+            <w:pPr>
+              <w:pStyle w:val="Compact"/>
+              <w:jc w:val="center"/>
+            </w:pPr>
+            <w:r>
+              <w:t xml:space="preserve">☐</w:t>
+            </w:r>
+          </w:p>
+        </w:tc>
+        <w:tc>
+          <w:tcPr/>
+          <w:p>
+            <w:pPr>
+              <w:pStyle w:val="Compact"/>
+              <w:jc w:val="center"/>
+            </w:pPr>
+            <w:r>
+              <w:t xml:space="preserve">☐</w:t>
+            </w:r>
           </w:p>
         </w:tc>
       </w:tr>
@@ -1461,7 +1621,7 @@
                 <w:b/>
                 <w:bCs/>
               </w:rPr>
-              <w:t xml:space="preserve">D · OVERALL ACCEPTANCE</w:t>
+              <w:t xml:space="preserve">System Functionality</w:t>
             </w:r>
           </w:p>
         </w:tc>
@@ -1514,48 +1674,68 @@
               <w:pStyle w:val="Compact"/>
             </w:pPr>
             <w:r>
-              <w:t xml:space="preserve">20. I accept this system as usable and fit for its purpose.</w:t>
-            </w:r>
-          </w:p>
-        </w:tc>
-        <w:tc>
-          <w:tcPr/>
-          <w:p>
-            <w:pPr>
-              <w:pStyle w:val="Compact"/>
-            </w:pPr>
-          </w:p>
-        </w:tc>
-        <w:tc>
-          <w:tcPr/>
-          <w:p>
-            <w:pPr>
-              <w:pStyle w:val="Compact"/>
-            </w:pPr>
-          </w:p>
-        </w:tc>
-        <w:tc>
-          <w:tcPr/>
-          <w:p>
-            <w:pPr>
-              <w:pStyle w:val="Compact"/>
-            </w:pPr>
-          </w:p>
-        </w:tc>
-        <w:tc>
-          <w:tcPr/>
-          <w:p>
-            <w:pPr>
-              <w:pStyle w:val="Compact"/>
-            </w:pPr>
-          </w:p>
-        </w:tc>
-        <w:tc>
-          <w:tcPr/>
-          <w:p>
-            <w:pPr>
-              <w:pStyle w:val="Compact"/>
-            </w:pPr>
+              <w:t xml:space="preserve">• Vulnerability findings are processed correctly</w:t>
+            </w:r>
+          </w:p>
+        </w:tc>
+        <w:tc>
+          <w:tcPr/>
+          <w:p>
+            <w:pPr>
+              <w:pStyle w:val="Compact"/>
+              <w:jc w:val="center"/>
+            </w:pPr>
+            <w:r>
+              <w:t xml:space="preserve">☐</w:t>
+            </w:r>
+          </w:p>
+        </w:tc>
+        <w:tc>
+          <w:tcPr/>
+          <w:p>
+            <w:pPr>
+              <w:pStyle w:val="Compact"/>
+              <w:jc w:val="center"/>
+            </w:pPr>
+            <w:r>
+              <w:t xml:space="preserve">☐</w:t>
+            </w:r>
+          </w:p>
+        </w:tc>
+        <w:tc>
+          <w:tcPr/>
+          <w:p>
+            <w:pPr>
+              <w:pStyle w:val="Compact"/>
+              <w:jc w:val="center"/>
+            </w:pPr>
+            <w:r>
+              <w:t xml:space="preserve">☐</w:t>
+            </w:r>
+          </w:p>
+        </w:tc>
+        <w:tc>
+          <w:tcPr/>
+          <w:p>
+            <w:pPr>
+              <w:pStyle w:val="Compact"/>
+              <w:jc w:val="center"/>
+            </w:pPr>
+            <w:r>
+              <w:t xml:space="preserve">☐</w:t>
+            </w:r>
+          </w:p>
+        </w:tc>
+        <w:tc>
+          <w:tcPr/>
+          <w:p>
+            <w:pPr>
+              <w:pStyle w:val="Compact"/>
+              <w:jc w:val="center"/>
+            </w:pPr>
+            <w:r>
+              <w:t xml:space="preserve">☐</w:t>
+            </w:r>
           </w:p>
         </w:tc>
       </w:tr>
@@ -1567,48 +1747,709 @@
               <w:pStyle w:val="Compact"/>
             </w:pPr>
             <w:r>
-              <w:t xml:space="preserve">21. I would recommend this system to others who triage scanner output.</w:t>
-            </w:r>
-          </w:p>
-        </w:tc>
-        <w:tc>
-          <w:tcPr/>
-          <w:p>
-            <w:pPr>
-              <w:pStyle w:val="Compact"/>
-            </w:pPr>
-          </w:p>
-        </w:tc>
-        <w:tc>
-          <w:tcPr/>
-          <w:p>
-            <w:pPr>
-              <w:pStyle w:val="Compact"/>
-            </w:pPr>
-          </w:p>
-        </w:tc>
-        <w:tc>
-          <w:tcPr/>
-          <w:p>
-            <w:pPr>
-              <w:pStyle w:val="Compact"/>
-            </w:pPr>
-          </w:p>
-        </w:tc>
-        <w:tc>
-          <w:tcPr/>
-          <w:p>
-            <w:pPr>
-              <w:pStyle w:val="Compact"/>
-            </w:pPr>
-          </w:p>
-        </w:tc>
-        <w:tc>
-          <w:tcPr/>
-          <w:p>
-            <w:pPr>
-              <w:pStyle w:val="Compact"/>
-            </w:pPr>
+              <w:t xml:space="preserve">• Duplicate findings are merged accurately</w:t>
+            </w:r>
+          </w:p>
+        </w:tc>
+        <w:tc>
+          <w:tcPr/>
+          <w:p>
+            <w:pPr>
+              <w:pStyle w:val="Compact"/>
+              <w:jc w:val="center"/>
+            </w:pPr>
+            <w:r>
+              <w:t xml:space="preserve">☐</w:t>
+            </w:r>
+          </w:p>
+        </w:tc>
+        <w:tc>
+          <w:tcPr/>
+          <w:p>
+            <w:pPr>
+              <w:pStyle w:val="Compact"/>
+              <w:jc w:val="center"/>
+            </w:pPr>
+            <w:r>
+              <w:t xml:space="preserve">☐</w:t>
+            </w:r>
+          </w:p>
+        </w:tc>
+        <w:tc>
+          <w:tcPr/>
+          <w:p>
+            <w:pPr>
+              <w:pStyle w:val="Compact"/>
+              <w:jc w:val="center"/>
+            </w:pPr>
+            <w:r>
+              <w:t xml:space="preserve">☐</w:t>
+            </w:r>
+          </w:p>
+        </w:tc>
+        <w:tc>
+          <w:tcPr/>
+          <w:p>
+            <w:pPr>
+              <w:pStyle w:val="Compact"/>
+              <w:jc w:val="center"/>
+            </w:pPr>
+            <w:r>
+              <w:t xml:space="preserve">☐</w:t>
+            </w:r>
+          </w:p>
+        </w:tc>
+        <w:tc>
+          <w:tcPr/>
+          <w:p>
+            <w:pPr>
+              <w:pStyle w:val="Compact"/>
+              <w:jc w:val="center"/>
+            </w:pPr>
+            <w:r>
+              <w:t xml:space="preserve">☐</w:t>
+            </w:r>
+          </w:p>
+        </w:tc>
+      </w:tr>
+      <w:tr>
+        <w:tc>
+          <w:tcPr/>
+          <w:p>
+            <w:pPr>
+              <w:pStyle w:val="Compact"/>
+            </w:pPr>
+            <w:r>
+              <w:t xml:space="preserve">• Confidence scores assist vulnerability prioritisation</w:t>
+            </w:r>
+          </w:p>
+        </w:tc>
+        <w:tc>
+          <w:tcPr/>
+          <w:p>
+            <w:pPr>
+              <w:pStyle w:val="Compact"/>
+              <w:jc w:val="center"/>
+            </w:pPr>
+            <w:r>
+              <w:t xml:space="preserve">☐</w:t>
+            </w:r>
+          </w:p>
+        </w:tc>
+        <w:tc>
+          <w:tcPr/>
+          <w:p>
+            <w:pPr>
+              <w:pStyle w:val="Compact"/>
+              <w:jc w:val="center"/>
+            </w:pPr>
+            <w:r>
+              <w:t xml:space="preserve">☐</w:t>
+            </w:r>
+          </w:p>
+        </w:tc>
+        <w:tc>
+          <w:tcPr/>
+          <w:p>
+            <w:pPr>
+              <w:pStyle w:val="Compact"/>
+              <w:jc w:val="center"/>
+            </w:pPr>
+            <w:r>
+              <w:t xml:space="preserve">☐</w:t>
+            </w:r>
+          </w:p>
+        </w:tc>
+        <w:tc>
+          <w:tcPr/>
+          <w:p>
+            <w:pPr>
+              <w:pStyle w:val="Compact"/>
+              <w:jc w:val="center"/>
+            </w:pPr>
+            <w:r>
+              <w:t xml:space="preserve">☐</w:t>
+            </w:r>
+          </w:p>
+        </w:tc>
+        <w:tc>
+          <w:tcPr/>
+          <w:p>
+            <w:pPr>
+              <w:pStyle w:val="Compact"/>
+              <w:jc w:val="center"/>
+            </w:pPr>
+            <w:r>
+              <w:t xml:space="preserve">☐</w:t>
+            </w:r>
+          </w:p>
+        </w:tc>
+      </w:tr>
+      <w:tr>
+        <w:tc>
+          <w:tcPr/>
+          <w:p>
+            <w:pPr>
+              <w:pStyle w:val="Compact"/>
+            </w:pPr>
+            <w:r>
+              <w:t xml:space="preserve">• Machine learning predictions are useful</w:t>
+            </w:r>
+          </w:p>
+        </w:tc>
+        <w:tc>
+          <w:tcPr/>
+          <w:p>
+            <w:pPr>
+              <w:pStyle w:val="Compact"/>
+              <w:jc w:val="center"/>
+            </w:pPr>
+            <w:r>
+              <w:t xml:space="preserve">☐</w:t>
+            </w:r>
+          </w:p>
+        </w:tc>
+        <w:tc>
+          <w:tcPr/>
+          <w:p>
+            <w:pPr>
+              <w:pStyle w:val="Compact"/>
+              <w:jc w:val="center"/>
+            </w:pPr>
+            <w:r>
+              <w:t xml:space="preserve">☐</w:t>
+            </w:r>
+          </w:p>
+        </w:tc>
+        <w:tc>
+          <w:tcPr/>
+          <w:p>
+            <w:pPr>
+              <w:pStyle w:val="Compact"/>
+              <w:jc w:val="center"/>
+            </w:pPr>
+            <w:r>
+              <w:t xml:space="preserve">☐</w:t>
+            </w:r>
+          </w:p>
+        </w:tc>
+        <w:tc>
+          <w:tcPr/>
+          <w:p>
+            <w:pPr>
+              <w:pStyle w:val="Compact"/>
+              <w:jc w:val="center"/>
+            </w:pPr>
+            <w:r>
+              <w:t xml:space="preserve">☐</w:t>
+            </w:r>
+          </w:p>
+        </w:tc>
+        <w:tc>
+          <w:tcPr/>
+          <w:p>
+            <w:pPr>
+              <w:pStyle w:val="Compact"/>
+              <w:jc w:val="center"/>
+            </w:pPr>
+            <w:r>
+              <w:t xml:space="preserve">☐</w:t>
+            </w:r>
+          </w:p>
+        </w:tc>
+      </w:tr>
+      <w:tr>
+        <w:tc>
+          <w:tcPr/>
+          <w:p>
+            <w:pPr>
+              <w:pStyle w:val="Compact"/>
+            </w:pPr>
+            <w:r>
+              <w:t xml:space="preserve">• AI-generated explanations are relevant and understandable</w:t>
+            </w:r>
+          </w:p>
+        </w:tc>
+        <w:tc>
+          <w:tcPr/>
+          <w:p>
+            <w:pPr>
+              <w:pStyle w:val="Compact"/>
+              <w:jc w:val="center"/>
+            </w:pPr>
+            <w:r>
+              <w:t xml:space="preserve">☐</w:t>
+            </w:r>
+          </w:p>
+        </w:tc>
+        <w:tc>
+          <w:tcPr/>
+          <w:p>
+            <w:pPr>
+              <w:pStyle w:val="Compact"/>
+              <w:jc w:val="center"/>
+            </w:pPr>
+            <w:r>
+              <w:t xml:space="preserve">☐</w:t>
+            </w:r>
+          </w:p>
+        </w:tc>
+        <w:tc>
+          <w:tcPr/>
+          <w:p>
+            <w:pPr>
+              <w:pStyle w:val="Compact"/>
+              <w:jc w:val="center"/>
+            </w:pPr>
+            <w:r>
+              <w:t xml:space="preserve">☐</w:t>
+            </w:r>
+          </w:p>
+        </w:tc>
+        <w:tc>
+          <w:tcPr/>
+          <w:p>
+            <w:pPr>
+              <w:pStyle w:val="Compact"/>
+              <w:jc w:val="center"/>
+            </w:pPr>
+            <w:r>
+              <w:t xml:space="preserve">☐</w:t>
+            </w:r>
+          </w:p>
+        </w:tc>
+        <w:tc>
+          <w:tcPr/>
+          <w:p>
+            <w:pPr>
+              <w:pStyle w:val="Compact"/>
+              <w:jc w:val="center"/>
+            </w:pPr>
+            <w:r>
+              <w:t xml:space="preserve">☐</w:t>
+            </w:r>
+          </w:p>
+        </w:tc>
+      </w:tr>
+      <w:tr>
+        <w:tc>
+          <w:tcPr/>
+          <w:p>
+            <w:pPr>
+              <w:pStyle w:val="Compact"/>
+            </w:pPr>
+            <w:r>
+              <w:t xml:space="preserve">• Generated reports are complete and downloadable</w:t>
+            </w:r>
+          </w:p>
+        </w:tc>
+        <w:tc>
+          <w:tcPr/>
+          <w:p>
+            <w:pPr>
+              <w:pStyle w:val="Compact"/>
+              <w:jc w:val="center"/>
+            </w:pPr>
+            <w:r>
+              <w:t xml:space="preserve">☐</w:t>
+            </w:r>
+          </w:p>
+        </w:tc>
+        <w:tc>
+          <w:tcPr/>
+          <w:p>
+            <w:pPr>
+              <w:pStyle w:val="Compact"/>
+              <w:jc w:val="center"/>
+            </w:pPr>
+            <w:r>
+              <w:t xml:space="preserve">☐</w:t>
+            </w:r>
+          </w:p>
+        </w:tc>
+        <w:tc>
+          <w:tcPr/>
+          <w:p>
+            <w:pPr>
+              <w:pStyle w:val="Compact"/>
+              <w:jc w:val="center"/>
+            </w:pPr>
+            <w:r>
+              <w:t xml:space="preserve">☐</w:t>
+            </w:r>
+          </w:p>
+        </w:tc>
+        <w:tc>
+          <w:tcPr/>
+          <w:p>
+            <w:pPr>
+              <w:pStyle w:val="Compact"/>
+              <w:jc w:val="center"/>
+            </w:pPr>
+            <w:r>
+              <w:t xml:space="preserve">☐</w:t>
+            </w:r>
+          </w:p>
+        </w:tc>
+        <w:tc>
+          <w:tcPr/>
+          <w:p>
+            <w:pPr>
+              <w:pStyle w:val="Compact"/>
+              <w:jc w:val="center"/>
+            </w:pPr>
+            <w:r>
+              <w:t xml:space="preserve">☐</w:t>
+            </w:r>
+          </w:p>
+        </w:tc>
+      </w:tr>
+      <w:tr>
+        <w:tc>
+          <w:tcPr/>
+          <w:p>
+            <w:pPr>
+              <w:pStyle w:val="Compact"/>
+            </w:pPr>
+            <w:r>
+              <w:rPr>
+                <w:b/>
+                <w:bCs/>
+              </w:rPr>
+              <w:t xml:space="preserve">System Reliability</w:t>
+            </w:r>
+          </w:p>
+        </w:tc>
+        <w:tc>
+          <w:tcPr/>
+          <w:p>
+            <w:pPr>
+              <w:pStyle w:val="Compact"/>
+            </w:pPr>
+          </w:p>
+        </w:tc>
+        <w:tc>
+          <w:tcPr/>
+          <w:p>
+            <w:pPr>
+              <w:pStyle w:val="Compact"/>
+            </w:pPr>
+          </w:p>
+        </w:tc>
+        <w:tc>
+          <w:tcPr/>
+          <w:p>
+            <w:pPr>
+              <w:pStyle w:val="Compact"/>
+            </w:pPr>
+          </w:p>
+        </w:tc>
+        <w:tc>
+          <w:tcPr/>
+          <w:p>
+            <w:pPr>
+              <w:pStyle w:val="Compact"/>
+            </w:pPr>
+          </w:p>
+        </w:tc>
+        <w:tc>
+          <w:tcPr/>
+          <w:p>
+            <w:pPr>
+              <w:pStyle w:val="Compact"/>
+            </w:pPr>
+          </w:p>
+        </w:tc>
+      </w:tr>
+      <w:tr>
+        <w:tc>
+          <w:tcPr/>
+          <w:p>
+            <w:pPr>
+              <w:pStyle w:val="Compact"/>
+            </w:pPr>
+            <w:r>
+              <w:t xml:space="preserve">• No critical system errors were encountered</w:t>
+            </w:r>
+          </w:p>
+        </w:tc>
+        <w:tc>
+          <w:tcPr/>
+          <w:p>
+            <w:pPr>
+              <w:pStyle w:val="Compact"/>
+              <w:jc w:val="center"/>
+            </w:pPr>
+            <w:r>
+              <w:t xml:space="preserve">☐</w:t>
+            </w:r>
+          </w:p>
+        </w:tc>
+        <w:tc>
+          <w:tcPr/>
+          <w:p>
+            <w:pPr>
+              <w:pStyle w:val="Compact"/>
+              <w:jc w:val="center"/>
+            </w:pPr>
+            <w:r>
+              <w:t xml:space="preserve">☐</w:t>
+            </w:r>
+          </w:p>
+        </w:tc>
+        <w:tc>
+          <w:tcPr/>
+          <w:p>
+            <w:pPr>
+              <w:pStyle w:val="Compact"/>
+              <w:jc w:val="center"/>
+            </w:pPr>
+            <w:r>
+              <w:t xml:space="preserve">☐</w:t>
+            </w:r>
+          </w:p>
+        </w:tc>
+        <w:tc>
+          <w:tcPr/>
+          <w:p>
+            <w:pPr>
+              <w:pStyle w:val="Compact"/>
+              <w:jc w:val="center"/>
+            </w:pPr>
+            <w:r>
+              <w:t xml:space="preserve">☐</w:t>
+            </w:r>
+          </w:p>
+        </w:tc>
+        <w:tc>
+          <w:tcPr/>
+          <w:p>
+            <w:pPr>
+              <w:pStyle w:val="Compact"/>
+              <w:jc w:val="center"/>
+            </w:pPr>
+            <w:r>
+              <w:t xml:space="preserve">☐</w:t>
+            </w:r>
+          </w:p>
+        </w:tc>
+      </w:tr>
+      <w:tr>
+        <w:tc>
+          <w:tcPr/>
+          <w:p>
+            <w:pPr>
+              <w:pStyle w:val="Compact"/>
+            </w:pPr>
+            <w:r>
+              <w:t xml:space="preserve">• System functions operate consistently</w:t>
+            </w:r>
+          </w:p>
+        </w:tc>
+        <w:tc>
+          <w:tcPr/>
+          <w:p>
+            <w:pPr>
+              <w:pStyle w:val="Compact"/>
+              <w:jc w:val="center"/>
+            </w:pPr>
+            <w:r>
+              <w:t xml:space="preserve">☐</w:t>
+            </w:r>
+          </w:p>
+        </w:tc>
+        <w:tc>
+          <w:tcPr/>
+          <w:p>
+            <w:pPr>
+              <w:pStyle w:val="Compact"/>
+              <w:jc w:val="center"/>
+            </w:pPr>
+            <w:r>
+              <w:t xml:space="preserve">☐</w:t>
+            </w:r>
+          </w:p>
+        </w:tc>
+        <w:tc>
+          <w:tcPr/>
+          <w:p>
+            <w:pPr>
+              <w:pStyle w:val="Compact"/>
+              <w:jc w:val="center"/>
+            </w:pPr>
+            <w:r>
+              <w:t xml:space="preserve">☐</w:t>
+            </w:r>
+          </w:p>
+        </w:tc>
+        <w:tc>
+          <w:tcPr/>
+          <w:p>
+            <w:pPr>
+              <w:pStyle w:val="Compact"/>
+              <w:jc w:val="center"/>
+            </w:pPr>
+            <w:r>
+              <w:t xml:space="preserve">☐</w:t>
+            </w:r>
+          </w:p>
+        </w:tc>
+        <w:tc>
+          <w:tcPr/>
+          <w:p>
+            <w:pPr>
+              <w:pStyle w:val="Compact"/>
+              <w:jc w:val="center"/>
+            </w:pPr>
+            <w:r>
+              <w:t xml:space="preserve">☐</w:t>
+            </w:r>
+          </w:p>
+        </w:tc>
+      </w:tr>
+      <w:tr>
+        <w:tc>
+          <w:tcPr/>
+          <w:p>
+            <w:pPr>
+              <w:pStyle w:val="Compact"/>
+            </w:pPr>
+            <w:r>
+              <w:t xml:space="preserve">• Overall application performance is satisfactory</w:t>
+            </w:r>
+          </w:p>
+        </w:tc>
+        <w:tc>
+          <w:tcPr/>
+          <w:p>
+            <w:pPr>
+              <w:pStyle w:val="Compact"/>
+              <w:jc w:val="center"/>
+            </w:pPr>
+            <w:r>
+              <w:t xml:space="preserve">☐</w:t>
+            </w:r>
+          </w:p>
+        </w:tc>
+        <w:tc>
+          <w:tcPr/>
+          <w:p>
+            <w:pPr>
+              <w:pStyle w:val="Compact"/>
+              <w:jc w:val="center"/>
+            </w:pPr>
+            <w:r>
+              <w:t xml:space="preserve">☐</w:t>
+            </w:r>
+          </w:p>
+        </w:tc>
+        <w:tc>
+          <w:tcPr/>
+          <w:p>
+            <w:pPr>
+              <w:pStyle w:val="Compact"/>
+              <w:jc w:val="center"/>
+            </w:pPr>
+            <w:r>
+              <w:t xml:space="preserve">☐</w:t>
+            </w:r>
+          </w:p>
+        </w:tc>
+        <w:tc>
+          <w:tcPr/>
+          <w:p>
+            <w:pPr>
+              <w:pStyle w:val="Compact"/>
+              <w:jc w:val="center"/>
+            </w:pPr>
+            <w:r>
+              <w:t xml:space="preserve">☐</w:t>
+            </w:r>
+          </w:p>
+        </w:tc>
+        <w:tc>
+          <w:tcPr/>
+          <w:p>
+            <w:pPr>
+              <w:pStyle w:val="Compact"/>
+              <w:jc w:val="center"/>
+            </w:pPr>
+            <w:r>
+              <w:t xml:space="preserve">☐</w:t>
+            </w:r>
+          </w:p>
+        </w:tc>
+      </w:tr>
+      <w:tr>
+        <w:tc>
+          <w:tcPr/>
+          <w:p>
+            <w:pPr>
+              <w:pStyle w:val="Compact"/>
+            </w:pPr>
+            <w:r>
+              <w:t xml:space="preserve">• Application remained stable throughout testing</w:t>
+            </w:r>
+          </w:p>
+        </w:tc>
+        <w:tc>
+          <w:tcPr/>
+          <w:p>
+            <w:pPr>
+              <w:pStyle w:val="Compact"/>
+              <w:jc w:val="center"/>
+            </w:pPr>
+            <w:r>
+              <w:t xml:space="preserve">☐</w:t>
+            </w:r>
+          </w:p>
+        </w:tc>
+        <w:tc>
+          <w:tcPr/>
+          <w:p>
+            <w:pPr>
+              <w:pStyle w:val="Compact"/>
+              <w:jc w:val="center"/>
+            </w:pPr>
+            <w:r>
+              <w:t xml:space="preserve">☐</w:t>
+            </w:r>
+          </w:p>
+        </w:tc>
+        <w:tc>
+          <w:tcPr/>
+          <w:p>
+            <w:pPr>
+              <w:pStyle w:val="Compact"/>
+              <w:jc w:val="center"/>
+            </w:pPr>
+            <w:r>
+              <w:t xml:space="preserve">☐</w:t>
+            </w:r>
+          </w:p>
+        </w:tc>
+        <w:tc>
+          <w:tcPr/>
+          <w:p>
+            <w:pPr>
+              <w:pStyle w:val="Compact"/>
+              <w:jc w:val="center"/>
+            </w:pPr>
+            <w:r>
+              <w:t xml:space="preserve">☐</w:t>
+            </w:r>
+          </w:p>
+        </w:tc>
+        <w:tc>
+          <w:tcPr/>
+          <w:p>
+            <w:pPr>
+              <w:pStyle w:val="Compact"/>
+              <w:jc w:val="center"/>
+            </w:pPr>
+            <w:r>
+              <w:t xml:space="preserve">☐</w:t>
+            </w:r>
           </w:p>
         </w:tc>
       </w:tr>
@@ -1622,7 +2463,7 @@
           <w:b/>
           <w:bCs/>
         </w:rPr>
-        <w:t xml:space="preserve">Comments &amp; suggestions</w:t>
+        <w:t xml:space="preserve">Tester Comments</w:t>
       </w:r>
     </w:p>
     <w:p>
@@ -1648,50 +2489,26 @@
           <w:b/>
           <w:bCs/>
         </w:rPr>
-        <w:t xml:space="preserve">Tester's signature:</w:t>
+        <w:t xml:space="preserve">Suggestions for Improvement / Actions Taken</w:t>
       </w:r>
+    </w:p>
+    <w:p>
       <w:r>
-        <w:t xml:space="preserve"> </w:t>
+        <w:pict>
+          <v:rect style="width:0;height:1.5pt" o:hralign="center" o:hrstd="t" o:hr="t"/>
+        </w:pict>
       </w:r>
+    </w:p>
+    <w:p>
       <w:r>
-        <w:t xml:space="preserve">__________________</w:t>
-      </w:r>
-      <w:r>
-        <w:t xml:space="preserve"> </w:t>
-      </w:r>
-      <w:r>
-        <w:rPr>
-          <w:b/>
-          <w:bCs/>
-        </w:rPr>
-        <w:t xml:space="preserve">Date:</w:t>
-      </w:r>
-      <w:r>
-        <w:t xml:space="preserve"> </w:t>
-      </w:r>
-      <w:r>
-        <w:t xml:space="preserve">__________</w:t>
-      </w:r>
-      <w:r>
-        <w:t xml:space="preserve"> </w:t>
-      </w:r>
-      <w:r>
-        <w:rPr>
-          <w:b/>
-          <w:bCs/>
-        </w:rPr>
-        <w:t xml:space="preserve">Facilitator:</w:t>
-      </w:r>
-      <w:r>
-        <w:t xml:space="preserve"> </w:t>
-      </w:r>
-      <w:r>
-        <w:t xml:space="preserve">__________________</w:t>
+        <w:pict>
+          <v:rect style="width:0;height:1.5pt" o:hralign="center" o:hrstd="t" o:hr="t"/>
+        </w:pict>
       </w:r>
     </w:p>
     <w:p>
       <w:pPr>
-        <w:pStyle w:val="BodyText"/>
+        <w:pStyle w:val="FirstParagraph"/>
       </w:pPr>
       <w:r>
         <w:rPr>

</xml_diff>

<commit_message>
docs: UAT form without checkbox glyphs (blank rating cells)
Remove the checkbox glyphs from the rating table; each 1-5 cell is now blank
so testers type an X in their chosen column when filling the form in Word.
Content, sections (Objectives/UI/UX/Functionality/Reliability) and header
unchanged. PDF + Word + Markdown regenerated.
</commit_message>
<xml_diff>
--- a/docs/UAT_Form.docx
+++ b/docs/UAT_Form.docx
@@ -38,7 +38,7 @@
         <w:t xml:space="preserve"> </w:t>
       </w:r>
       <w:r>
-        <w:t xml:space="preserve">Thank you for helping evaluate VulnTriage. Please use the system (register &amp; log in, upload a scanner report and run the triage, review the dashboard and a finding's details, run an authorised Auto Scan, and generate the PDF report), then rate each statement below. To answer in Word, replace the ☐ in your chosen column with ☒ (or type an</w:t>
+        <w:t xml:space="preserve">Thank you for helping evaluate VulnTriage. Please use the system (register &amp; log in, upload a scanner report and run the triage, review the dashboard and a finding's details, run an authorised Auto Scan, and generate the PDF report), then rate each statement below by typing an</w:t>
       </w:r>
       <w:r>
         <w:t xml:space="preserve"> </w:t>
@@ -54,7 +54,7 @@
         <w:t xml:space="preserve"> </w:t>
       </w:r>
       <w:r>
-        <w:t xml:space="preserve">over it). There are no right or wrong answers.</w:t>
+        <w:t xml:space="preserve">in the column that best matches your rating. There are no right or wrong answers.</w:t>
       </w:r>
     </w:p>
     <w:p>
@@ -344,59 +344,39 @@
           <w:p>
             <w:pPr>
               <w:pStyle w:val="Compact"/>
-              <w:jc w:val="center"/>
-            </w:pPr>
-            <w:r>
-              <w:t xml:space="preserve">☐</w:t>
-            </w:r>
-          </w:p>
-        </w:tc>
-        <w:tc>
-          <w:tcPr/>
-          <w:p>
-            <w:pPr>
-              <w:pStyle w:val="Compact"/>
-              <w:jc w:val="center"/>
-            </w:pPr>
-            <w:r>
-              <w:t xml:space="preserve">☐</w:t>
-            </w:r>
-          </w:p>
-        </w:tc>
-        <w:tc>
-          <w:tcPr/>
-          <w:p>
-            <w:pPr>
-              <w:pStyle w:val="Compact"/>
-              <w:jc w:val="center"/>
-            </w:pPr>
-            <w:r>
-              <w:t xml:space="preserve">☐</w:t>
-            </w:r>
-          </w:p>
-        </w:tc>
-        <w:tc>
-          <w:tcPr/>
-          <w:p>
-            <w:pPr>
-              <w:pStyle w:val="Compact"/>
-              <w:jc w:val="center"/>
-            </w:pPr>
-            <w:r>
-              <w:t xml:space="preserve">☐</w:t>
-            </w:r>
-          </w:p>
-        </w:tc>
-        <w:tc>
-          <w:tcPr/>
-          <w:p>
-            <w:pPr>
-              <w:pStyle w:val="Compact"/>
-              <w:jc w:val="center"/>
-            </w:pPr>
-            <w:r>
-              <w:t xml:space="preserve">☐</w:t>
-            </w:r>
+            </w:pPr>
+          </w:p>
+        </w:tc>
+        <w:tc>
+          <w:tcPr/>
+          <w:p>
+            <w:pPr>
+              <w:pStyle w:val="Compact"/>
+            </w:pPr>
+          </w:p>
+        </w:tc>
+        <w:tc>
+          <w:tcPr/>
+          <w:p>
+            <w:pPr>
+              <w:pStyle w:val="Compact"/>
+            </w:pPr>
+          </w:p>
+        </w:tc>
+        <w:tc>
+          <w:tcPr/>
+          <w:p>
+            <w:pPr>
+              <w:pStyle w:val="Compact"/>
+            </w:pPr>
+          </w:p>
+        </w:tc>
+        <w:tc>
+          <w:tcPr/>
+          <w:p>
+            <w:pPr>
+              <w:pStyle w:val="Compact"/>
+            </w:pPr>
           </w:p>
         </w:tc>
       </w:tr>
@@ -417,59 +397,39 @@
           <w:p>
             <w:pPr>
               <w:pStyle w:val="Compact"/>
-              <w:jc w:val="center"/>
-            </w:pPr>
-            <w:r>
-              <w:t xml:space="preserve">☐</w:t>
-            </w:r>
-          </w:p>
-        </w:tc>
-        <w:tc>
-          <w:tcPr/>
-          <w:p>
-            <w:pPr>
-              <w:pStyle w:val="Compact"/>
-              <w:jc w:val="center"/>
-            </w:pPr>
-            <w:r>
-              <w:t xml:space="preserve">☐</w:t>
-            </w:r>
-          </w:p>
-        </w:tc>
-        <w:tc>
-          <w:tcPr/>
-          <w:p>
-            <w:pPr>
-              <w:pStyle w:val="Compact"/>
-              <w:jc w:val="center"/>
-            </w:pPr>
-            <w:r>
-              <w:t xml:space="preserve">☐</w:t>
-            </w:r>
-          </w:p>
-        </w:tc>
-        <w:tc>
-          <w:tcPr/>
-          <w:p>
-            <w:pPr>
-              <w:pStyle w:val="Compact"/>
-              <w:jc w:val="center"/>
-            </w:pPr>
-            <w:r>
-              <w:t xml:space="preserve">☐</w:t>
-            </w:r>
-          </w:p>
-        </w:tc>
-        <w:tc>
-          <w:tcPr/>
-          <w:p>
-            <w:pPr>
-              <w:pStyle w:val="Compact"/>
-              <w:jc w:val="center"/>
-            </w:pPr>
-            <w:r>
-              <w:t xml:space="preserve">☐</w:t>
-            </w:r>
+            </w:pPr>
+          </w:p>
+        </w:tc>
+        <w:tc>
+          <w:tcPr/>
+          <w:p>
+            <w:pPr>
+              <w:pStyle w:val="Compact"/>
+            </w:pPr>
+          </w:p>
+        </w:tc>
+        <w:tc>
+          <w:tcPr/>
+          <w:p>
+            <w:pPr>
+              <w:pStyle w:val="Compact"/>
+            </w:pPr>
+          </w:p>
+        </w:tc>
+        <w:tc>
+          <w:tcPr/>
+          <w:p>
+            <w:pPr>
+              <w:pStyle w:val="Compact"/>
+            </w:pPr>
+          </w:p>
+        </w:tc>
+        <w:tc>
+          <w:tcPr/>
+          <w:p>
+            <w:pPr>
+              <w:pStyle w:val="Compact"/>
+            </w:pPr>
           </w:p>
         </w:tc>
       </w:tr>
@@ -490,59 +450,39 @@
           <w:p>
             <w:pPr>
               <w:pStyle w:val="Compact"/>
-              <w:jc w:val="center"/>
-            </w:pPr>
-            <w:r>
-              <w:t xml:space="preserve">☐</w:t>
-            </w:r>
-          </w:p>
-        </w:tc>
-        <w:tc>
-          <w:tcPr/>
-          <w:p>
-            <w:pPr>
-              <w:pStyle w:val="Compact"/>
-              <w:jc w:val="center"/>
-            </w:pPr>
-            <w:r>
-              <w:t xml:space="preserve">☐</w:t>
-            </w:r>
-          </w:p>
-        </w:tc>
-        <w:tc>
-          <w:tcPr/>
-          <w:p>
-            <w:pPr>
-              <w:pStyle w:val="Compact"/>
-              <w:jc w:val="center"/>
-            </w:pPr>
-            <w:r>
-              <w:t xml:space="preserve">☐</w:t>
-            </w:r>
-          </w:p>
-        </w:tc>
-        <w:tc>
-          <w:tcPr/>
-          <w:p>
-            <w:pPr>
-              <w:pStyle w:val="Compact"/>
-              <w:jc w:val="center"/>
-            </w:pPr>
-            <w:r>
-              <w:t xml:space="preserve">☐</w:t>
-            </w:r>
-          </w:p>
-        </w:tc>
-        <w:tc>
-          <w:tcPr/>
-          <w:p>
-            <w:pPr>
-              <w:pStyle w:val="Compact"/>
-              <w:jc w:val="center"/>
-            </w:pPr>
-            <w:r>
-              <w:t xml:space="preserve">☐</w:t>
-            </w:r>
+            </w:pPr>
+          </w:p>
+        </w:tc>
+        <w:tc>
+          <w:tcPr/>
+          <w:p>
+            <w:pPr>
+              <w:pStyle w:val="Compact"/>
+            </w:pPr>
+          </w:p>
+        </w:tc>
+        <w:tc>
+          <w:tcPr/>
+          <w:p>
+            <w:pPr>
+              <w:pStyle w:val="Compact"/>
+            </w:pPr>
+          </w:p>
+        </w:tc>
+        <w:tc>
+          <w:tcPr/>
+          <w:p>
+            <w:pPr>
+              <w:pStyle w:val="Compact"/>
+            </w:pPr>
+          </w:p>
+        </w:tc>
+        <w:tc>
+          <w:tcPr/>
+          <w:p>
+            <w:pPr>
+              <w:pStyle w:val="Compact"/>
+            </w:pPr>
           </w:p>
         </w:tc>
       </w:tr>
@@ -563,59 +503,39 @@
           <w:p>
             <w:pPr>
               <w:pStyle w:val="Compact"/>
-              <w:jc w:val="center"/>
-            </w:pPr>
-            <w:r>
-              <w:t xml:space="preserve">☐</w:t>
-            </w:r>
-          </w:p>
-        </w:tc>
-        <w:tc>
-          <w:tcPr/>
-          <w:p>
-            <w:pPr>
-              <w:pStyle w:val="Compact"/>
-              <w:jc w:val="center"/>
-            </w:pPr>
-            <w:r>
-              <w:t xml:space="preserve">☐</w:t>
-            </w:r>
-          </w:p>
-        </w:tc>
-        <w:tc>
-          <w:tcPr/>
-          <w:p>
-            <w:pPr>
-              <w:pStyle w:val="Compact"/>
-              <w:jc w:val="center"/>
-            </w:pPr>
-            <w:r>
-              <w:t xml:space="preserve">☐</w:t>
-            </w:r>
-          </w:p>
-        </w:tc>
-        <w:tc>
-          <w:tcPr/>
-          <w:p>
-            <w:pPr>
-              <w:pStyle w:val="Compact"/>
-              <w:jc w:val="center"/>
-            </w:pPr>
-            <w:r>
-              <w:t xml:space="preserve">☐</w:t>
-            </w:r>
-          </w:p>
-        </w:tc>
-        <w:tc>
-          <w:tcPr/>
-          <w:p>
-            <w:pPr>
-              <w:pStyle w:val="Compact"/>
-              <w:jc w:val="center"/>
-            </w:pPr>
-            <w:r>
-              <w:t xml:space="preserve">☐</w:t>
-            </w:r>
+            </w:pPr>
+          </w:p>
+        </w:tc>
+        <w:tc>
+          <w:tcPr/>
+          <w:p>
+            <w:pPr>
+              <w:pStyle w:val="Compact"/>
+            </w:pPr>
+          </w:p>
+        </w:tc>
+        <w:tc>
+          <w:tcPr/>
+          <w:p>
+            <w:pPr>
+              <w:pStyle w:val="Compact"/>
+            </w:pPr>
+          </w:p>
+        </w:tc>
+        <w:tc>
+          <w:tcPr/>
+          <w:p>
+            <w:pPr>
+              <w:pStyle w:val="Compact"/>
+            </w:pPr>
+          </w:p>
+        </w:tc>
+        <w:tc>
+          <w:tcPr/>
+          <w:p>
+            <w:pPr>
+              <w:pStyle w:val="Compact"/>
+            </w:pPr>
           </w:p>
         </w:tc>
       </w:tr>
@@ -636,59 +556,39 @@
           <w:p>
             <w:pPr>
               <w:pStyle w:val="Compact"/>
-              <w:jc w:val="center"/>
-            </w:pPr>
-            <w:r>
-              <w:t xml:space="preserve">☐</w:t>
-            </w:r>
-          </w:p>
-        </w:tc>
-        <w:tc>
-          <w:tcPr/>
-          <w:p>
-            <w:pPr>
-              <w:pStyle w:val="Compact"/>
-              <w:jc w:val="center"/>
-            </w:pPr>
-            <w:r>
-              <w:t xml:space="preserve">☐</w:t>
-            </w:r>
-          </w:p>
-        </w:tc>
-        <w:tc>
-          <w:tcPr/>
-          <w:p>
-            <w:pPr>
-              <w:pStyle w:val="Compact"/>
-              <w:jc w:val="center"/>
-            </w:pPr>
-            <w:r>
-              <w:t xml:space="preserve">☐</w:t>
-            </w:r>
-          </w:p>
-        </w:tc>
-        <w:tc>
-          <w:tcPr/>
-          <w:p>
-            <w:pPr>
-              <w:pStyle w:val="Compact"/>
-              <w:jc w:val="center"/>
-            </w:pPr>
-            <w:r>
-              <w:t xml:space="preserve">☐</w:t>
-            </w:r>
-          </w:p>
-        </w:tc>
-        <w:tc>
-          <w:tcPr/>
-          <w:p>
-            <w:pPr>
-              <w:pStyle w:val="Compact"/>
-              <w:jc w:val="center"/>
-            </w:pPr>
-            <w:r>
-              <w:t xml:space="preserve">☐</w:t>
-            </w:r>
+            </w:pPr>
+          </w:p>
+        </w:tc>
+        <w:tc>
+          <w:tcPr/>
+          <w:p>
+            <w:pPr>
+              <w:pStyle w:val="Compact"/>
+            </w:pPr>
+          </w:p>
+        </w:tc>
+        <w:tc>
+          <w:tcPr/>
+          <w:p>
+            <w:pPr>
+              <w:pStyle w:val="Compact"/>
+            </w:pPr>
+          </w:p>
+        </w:tc>
+        <w:tc>
+          <w:tcPr/>
+          <w:p>
+            <w:pPr>
+              <w:pStyle w:val="Compact"/>
+            </w:pPr>
+          </w:p>
+        </w:tc>
+        <w:tc>
+          <w:tcPr/>
+          <w:p>
+            <w:pPr>
+              <w:pStyle w:val="Compact"/>
+            </w:pPr>
           </w:p>
         </w:tc>
       </w:tr>
@@ -709,59 +609,39 @@
           <w:p>
             <w:pPr>
               <w:pStyle w:val="Compact"/>
-              <w:jc w:val="center"/>
-            </w:pPr>
-            <w:r>
-              <w:t xml:space="preserve">☐</w:t>
-            </w:r>
-          </w:p>
-        </w:tc>
-        <w:tc>
-          <w:tcPr/>
-          <w:p>
-            <w:pPr>
-              <w:pStyle w:val="Compact"/>
-              <w:jc w:val="center"/>
-            </w:pPr>
-            <w:r>
-              <w:t xml:space="preserve">☐</w:t>
-            </w:r>
-          </w:p>
-        </w:tc>
-        <w:tc>
-          <w:tcPr/>
-          <w:p>
-            <w:pPr>
-              <w:pStyle w:val="Compact"/>
-              <w:jc w:val="center"/>
-            </w:pPr>
-            <w:r>
-              <w:t xml:space="preserve">☐</w:t>
-            </w:r>
-          </w:p>
-        </w:tc>
-        <w:tc>
-          <w:tcPr/>
-          <w:p>
-            <w:pPr>
-              <w:pStyle w:val="Compact"/>
-              <w:jc w:val="center"/>
-            </w:pPr>
-            <w:r>
-              <w:t xml:space="preserve">☐</w:t>
-            </w:r>
-          </w:p>
-        </w:tc>
-        <w:tc>
-          <w:tcPr/>
-          <w:p>
-            <w:pPr>
-              <w:pStyle w:val="Compact"/>
-              <w:jc w:val="center"/>
-            </w:pPr>
-            <w:r>
-              <w:t xml:space="preserve">☐</w:t>
-            </w:r>
+            </w:pPr>
+          </w:p>
+        </w:tc>
+        <w:tc>
+          <w:tcPr/>
+          <w:p>
+            <w:pPr>
+              <w:pStyle w:val="Compact"/>
+            </w:pPr>
+          </w:p>
+        </w:tc>
+        <w:tc>
+          <w:tcPr/>
+          <w:p>
+            <w:pPr>
+              <w:pStyle w:val="Compact"/>
+            </w:pPr>
+          </w:p>
+        </w:tc>
+        <w:tc>
+          <w:tcPr/>
+          <w:p>
+            <w:pPr>
+              <w:pStyle w:val="Compact"/>
+            </w:pPr>
+          </w:p>
+        </w:tc>
+        <w:tc>
+          <w:tcPr/>
+          <w:p>
+            <w:pPr>
+              <w:pStyle w:val="Compact"/>
+            </w:pPr>
           </w:p>
         </w:tc>
       </w:tr>
@@ -839,59 +719,39 @@
           <w:p>
             <w:pPr>
               <w:pStyle w:val="Compact"/>
-              <w:jc w:val="center"/>
-            </w:pPr>
-            <w:r>
-              <w:t xml:space="preserve">☐</w:t>
-            </w:r>
-          </w:p>
-        </w:tc>
-        <w:tc>
-          <w:tcPr/>
-          <w:p>
-            <w:pPr>
-              <w:pStyle w:val="Compact"/>
-              <w:jc w:val="center"/>
-            </w:pPr>
-            <w:r>
-              <w:t xml:space="preserve">☐</w:t>
-            </w:r>
-          </w:p>
-        </w:tc>
-        <w:tc>
-          <w:tcPr/>
-          <w:p>
-            <w:pPr>
-              <w:pStyle w:val="Compact"/>
-              <w:jc w:val="center"/>
-            </w:pPr>
-            <w:r>
-              <w:t xml:space="preserve">☐</w:t>
-            </w:r>
-          </w:p>
-        </w:tc>
-        <w:tc>
-          <w:tcPr/>
-          <w:p>
-            <w:pPr>
-              <w:pStyle w:val="Compact"/>
-              <w:jc w:val="center"/>
-            </w:pPr>
-            <w:r>
-              <w:t xml:space="preserve">☐</w:t>
-            </w:r>
-          </w:p>
-        </w:tc>
-        <w:tc>
-          <w:tcPr/>
-          <w:p>
-            <w:pPr>
-              <w:pStyle w:val="Compact"/>
-              <w:jc w:val="center"/>
-            </w:pPr>
-            <w:r>
-              <w:t xml:space="preserve">☐</w:t>
-            </w:r>
+            </w:pPr>
+          </w:p>
+        </w:tc>
+        <w:tc>
+          <w:tcPr/>
+          <w:p>
+            <w:pPr>
+              <w:pStyle w:val="Compact"/>
+            </w:pPr>
+          </w:p>
+        </w:tc>
+        <w:tc>
+          <w:tcPr/>
+          <w:p>
+            <w:pPr>
+              <w:pStyle w:val="Compact"/>
+            </w:pPr>
+          </w:p>
+        </w:tc>
+        <w:tc>
+          <w:tcPr/>
+          <w:p>
+            <w:pPr>
+              <w:pStyle w:val="Compact"/>
+            </w:pPr>
+          </w:p>
+        </w:tc>
+        <w:tc>
+          <w:tcPr/>
+          <w:p>
+            <w:pPr>
+              <w:pStyle w:val="Compact"/>
+            </w:pPr>
           </w:p>
         </w:tc>
       </w:tr>
@@ -912,59 +772,39 @@
           <w:p>
             <w:pPr>
               <w:pStyle w:val="Compact"/>
-              <w:jc w:val="center"/>
-            </w:pPr>
-            <w:r>
-              <w:t xml:space="preserve">☐</w:t>
-            </w:r>
-          </w:p>
-        </w:tc>
-        <w:tc>
-          <w:tcPr/>
-          <w:p>
-            <w:pPr>
-              <w:pStyle w:val="Compact"/>
-              <w:jc w:val="center"/>
-            </w:pPr>
-            <w:r>
-              <w:t xml:space="preserve">☐</w:t>
-            </w:r>
-          </w:p>
-        </w:tc>
-        <w:tc>
-          <w:tcPr/>
-          <w:p>
-            <w:pPr>
-              <w:pStyle w:val="Compact"/>
-              <w:jc w:val="center"/>
-            </w:pPr>
-            <w:r>
-              <w:t xml:space="preserve">☐</w:t>
-            </w:r>
-          </w:p>
-        </w:tc>
-        <w:tc>
-          <w:tcPr/>
-          <w:p>
-            <w:pPr>
-              <w:pStyle w:val="Compact"/>
-              <w:jc w:val="center"/>
-            </w:pPr>
-            <w:r>
-              <w:t xml:space="preserve">☐</w:t>
-            </w:r>
-          </w:p>
-        </w:tc>
-        <w:tc>
-          <w:tcPr/>
-          <w:p>
-            <w:pPr>
-              <w:pStyle w:val="Compact"/>
-              <w:jc w:val="center"/>
-            </w:pPr>
-            <w:r>
-              <w:t xml:space="preserve">☐</w:t>
-            </w:r>
+            </w:pPr>
+          </w:p>
+        </w:tc>
+        <w:tc>
+          <w:tcPr/>
+          <w:p>
+            <w:pPr>
+              <w:pStyle w:val="Compact"/>
+            </w:pPr>
+          </w:p>
+        </w:tc>
+        <w:tc>
+          <w:tcPr/>
+          <w:p>
+            <w:pPr>
+              <w:pStyle w:val="Compact"/>
+            </w:pPr>
+          </w:p>
+        </w:tc>
+        <w:tc>
+          <w:tcPr/>
+          <w:p>
+            <w:pPr>
+              <w:pStyle w:val="Compact"/>
+            </w:pPr>
+          </w:p>
+        </w:tc>
+        <w:tc>
+          <w:tcPr/>
+          <w:p>
+            <w:pPr>
+              <w:pStyle w:val="Compact"/>
+            </w:pPr>
           </w:p>
         </w:tc>
       </w:tr>
@@ -985,59 +825,39 @@
           <w:p>
             <w:pPr>
               <w:pStyle w:val="Compact"/>
-              <w:jc w:val="center"/>
-            </w:pPr>
-            <w:r>
-              <w:t xml:space="preserve">☐</w:t>
-            </w:r>
-          </w:p>
-        </w:tc>
-        <w:tc>
-          <w:tcPr/>
-          <w:p>
-            <w:pPr>
-              <w:pStyle w:val="Compact"/>
-              <w:jc w:val="center"/>
-            </w:pPr>
-            <w:r>
-              <w:t xml:space="preserve">☐</w:t>
-            </w:r>
-          </w:p>
-        </w:tc>
-        <w:tc>
-          <w:tcPr/>
-          <w:p>
-            <w:pPr>
-              <w:pStyle w:val="Compact"/>
-              <w:jc w:val="center"/>
-            </w:pPr>
-            <w:r>
-              <w:t xml:space="preserve">☐</w:t>
-            </w:r>
-          </w:p>
-        </w:tc>
-        <w:tc>
-          <w:tcPr/>
-          <w:p>
-            <w:pPr>
-              <w:pStyle w:val="Compact"/>
-              <w:jc w:val="center"/>
-            </w:pPr>
-            <w:r>
-              <w:t xml:space="preserve">☐</w:t>
-            </w:r>
-          </w:p>
-        </w:tc>
-        <w:tc>
-          <w:tcPr/>
-          <w:p>
-            <w:pPr>
-              <w:pStyle w:val="Compact"/>
-              <w:jc w:val="center"/>
-            </w:pPr>
-            <w:r>
-              <w:t xml:space="preserve">☐</w:t>
-            </w:r>
+            </w:pPr>
+          </w:p>
+        </w:tc>
+        <w:tc>
+          <w:tcPr/>
+          <w:p>
+            <w:pPr>
+              <w:pStyle w:val="Compact"/>
+            </w:pPr>
+          </w:p>
+        </w:tc>
+        <w:tc>
+          <w:tcPr/>
+          <w:p>
+            <w:pPr>
+              <w:pStyle w:val="Compact"/>
+            </w:pPr>
+          </w:p>
+        </w:tc>
+        <w:tc>
+          <w:tcPr/>
+          <w:p>
+            <w:pPr>
+              <w:pStyle w:val="Compact"/>
+            </w:pPr>
+          </w:p>
+        </w:tc>
+        <w:tc>
+          <w:tcPr/>
+          <w:p>
+            <w:pPr>
+              <w:pStyle w:val="Compact"/>
+            </w:pPr>
           </w:p>
         </w:tc>
       </w:tr>
@@ -1058,59 +878,39 @@
           <w:p>
             <w:pPr>
               <w:pStyle w:val="Compact"/>
-              <w:jc w:val="center"/>
-            </w:pPr>
-            <w:r>
-              <w:t xml:space="preserve">☐</w:t>
-            </w:r>
-          </w:p>
-        </w:tc>
-        <w:tc>
-          <w:tcPr/>
-          <w:p>
-            <w:pPr>
-              <w:pStyle w:val="Compact"/>
-              <w:jc w:val="center"/>
-            </w:pPr>
-            <w:r>
-              <w:t xml:space="preserve">☐</w:t>
-            </w:r>
-          </w:p>
-        </w:tc>
-        <w:tc>
-          <w:tcPr/>
-          <w:p>
-            <w:pPr>
-              <w:pStyle w:val="Compact"/>
-              <w:jc w:val="center"/>
-            </w:pPr>
-            <w:r>
-              <w:t xml:space="preserve">☐</w:t>
-            </w:r>
-          </w:p>
-        </w:tc>
-        <w:tc>
-          <w:tcPr/>
-          <w:p>
-            <w:pPr>
-              <w:pStyle w:val="Compact"/>
-              <w:jc w:val="center"/>
-            </w:pPr>
-            <w:r>
-              <w:t xml:space="preserve">☐</w:t>
-            </w:r>
-          </w:p>
-        </w:tc>
-        <w:tc>
-          <w:tcPr/>
-          <w:p>
-            <w:pPr>
-              <w:pStyle w:val="Compact"/>
-              <w:jc w:val="center"/>
-            </w:pPr>
-            <w:r>
-              <w:t xml:space="preserve">☐</w:t>
-            </w:r>
+            </w:pPr>
+          </w:p>
+        </w:tc>
+        <w:tc>
+          <w:tcPr/>
+          <w:p>
+            <w:pPr>
+              <w:pStyle w:val="Compact"/>
+            </w:pPr>
+          </w:p>
+        </w:tc>
+        <w:tc>
+          <w:tcPr/>
+          <w:p>
+            <w:pPr>
+              <w:pStyle w:val="Compact"/>
+            </w:pPr>
+          </w:p>
+        </w:tc>
+        <w:tc>
+          <w:tcPr/>
+          <w:p>
+            <w:pPr>
+              <w:pStyle w:val="Compact"/>
+            </w:pPr>
+          </w:p>
+        </w:tc>
+        <w:tc>
+          <w:tcPr/>
+          <w:p>
+            <w:pPr>
+              <w:pStyle w:val="Compact"/>
+            </w:pPr>
           </w:p>
         </w:tc>
       </w:tr>
@@ -1131,59 +931,39 @@
           <w:p>
             <w:pPr>
               <w:pStyle w:val="Compact"/>
-              <w:jc w:val="center"/>
-            </w:pPr>
-            <w:r>
-              <w:t xml:space="preserve">☐</w:t>
-            </w:r>
-          </w:p>
-        </w:tc>
-        <w:tc>
-          <w:tcPr/>
-          <w:p>
-            <w:pPr>
-              <w:pStyle w:val="Compact"/>
-              <w:jc w:val="center"/>
-            </w:pPr>
-            <w:r>
-              <w:t xml:space="preserve">☐</w:t>
-            </w:r>
-          </w:p>
-        </w:tc>
-        <w:tc>
-          <w:tcPr/>
-          <w:p>
-            <w:pPr>
-              <w:pStyle w:val="Compact"/>
-              <w:jc w:val="center"/>
-            </w:pPr>
-            <w:r>
-              <w:t xml:space="preserve">☐</w:t>
-            </w:r>
-          </w:p>
-        </w:tc>
-        <w:tc>
-          <w:tcPr/>
-          <w:p>
-            <w:pPr>
-              <w:pStyle w:val="Compact"/>
-              <w:jc w:val="center"/>
-            </w:pPr>
-            <w:r>
-              <w:t xml:space="preserve">☐</w:t>
-            </w:r>
-          </w:p>
-        </w:tc>
-        <w:tc>
-          <w:tcPr/>
-          <w:p>
-            <w:pPr>
-              <w:pStyle w:val="Compact"/>
-              <w:jc w:val="center"/>
-            </w:pPr>
-            <w:r>
-              <w:t xml:space="preserve">☐</w:t>
-            </w:r>
+            </w:pPr>
+          </w:p>
+        </w:tc>
+        <w:tc>
+          <w:tcPr/>
+          <w:p>
+            <w:pPr>
+              <w:pStyle w:val="Compact"/>
+            </w:pPr>
+          </w:p>
+        </w:tc>
+        <w:tc>
+          <w:tcPr/>
+          <w:p>
+            <w:pPr>
+              <w:pStyle w:val="Compact"/>
+            </w:pPr>
+          </w:p>
+        </w:tc>
+        <w:tc>
+          <w:tcPr/>
+          <w:p>
+            <w:pPr>
+              <w:pStyle w:val="Compact"/>
+            </w:pPr>
+          </w:p>
+        </w:tc>
+        <w:tc>
+          <w:tcPr/>
+          <w:p>
+            <w:pPr>
+              <w:pStyle w:val="Compact"/>
+            </w:pPr>
           </w:p>
         </w:tc>
       </w:tr>
@@ -1261,59 +1041,39 @@
           <w:p>
             <w:pPr>
               <w:pStyle w:val="Compact"/>
-              <w:jc w:val="center"/>
-            </w:pPr>
-            <w:r>
-              <w:t xml:space="preserve">☐</w:t>
-            </w:r>
-          </w:p>
-        </w:tc>
-        <w:tc>
-          <w:tcPr/>
-          <w:p>
-            <w:pPr>
-              <w:pStyle w:val="Compact"/>
-              <w:jc w:val="center"/>
-            </w:pPr>
-            <w:r>
-              <w:t xml:space="preserve">☐</w:t>
-            </w:r>
-          </w:p>
-        </w:tc>
-        <w:tc>
-          <w:tcPr/>
-          <w:p>
-            <w:pPr>
-              <w:pStyle w:val="Compact"/>
-              <w:jc w:val="center"/>
-            </w:pPr>
-            <w:r>
-              <w:t xml:space="preserve">☐</w:t>
-            </w:r>
-          </w:p>
-        </w:tc>
-        <w:tc>
-          <w:tcPr/>
-          <w:p>
-            <w:pPr>
-              <w:pStyle w:val="Compact"/>
-              <w:jc w:val="center"/>
-            </w:pPr>
-            <w:r>
-              <w:t xml:space="preserve">☐</w:t>
-            </w:r>
-          </w:p>
-        </w:tc>
-        <w:tc>
-          <w:tcPr/>
-          <w:p>
-            <w:pPr>
-              <w:pStyle w:val="Compact"/>
-              <w:jc w:val="center"/>
-            </w:pPr>
-            <w:r>
-              <w:t xml:space="preserve">☐</w:t>
-            </w:r>
+            </w:pPr>
+          </w:p>
+        </w:tc>
+        <w:tc>
+          <w:tcPr/>
+          <w:p>
+            <w:pPr>
+              <w:pStyle w:val="Compact"/>
+            </w:pPr>
+          </w:p>
+        </w:tc>
+        <w:tc>
+          <w:tcPr/>
+          <w:p>
+            <w:pPr>
+              <w:pStyle w:val="Compact"/>
+            </w:pPr>
+          </w:p>
+        </w:tc>
+        <w:tc>
+          <w:tcPr/>
+          <w:p>
+            <w:pPr>
+              <w:pStyle w:val="Compact"/>
+            </w:pPr>
+          </w:p>
+        </w:tc>
+        <w:tc>
+          <w:tcPr/>
+          <w:p>
+            <w:pPr>
+              <w:pStyle w:val="Compact"/>
+            </w:pPr>
           </w:p>
         </w:tc>
       </w:tr>
@@ -1334,59 +1094,39 @@
           <w:p>
             <w:pPr>
               <w:pStyle w:val="Compact"/>
-              <w:jc w:val="center"/>
-            </w:pPr>
-            <w:r>
-              <w:t xml:space="preserve">☐</w:t>
-            </w:r>
-          </w:p>
-        </w:tc>
-        <w:tc>
-          <w:tcPr/>
-          <w:p>
-            <w:pPr>
-              <w:pStyle w:val="Compact"/>
-              <w:jc w:val="center"/>
-            </w:pPr>
-            <w:r>
-              <w:t xml:space="preserve">☐</w:t>
-            </w:r>
-          </w:p>
-        </w:tc>
-        <w:tc>
-          <w:tcPr/>
-          <w:p>
-            <w:pPr>
-              <w:pStyle w:val="Compact"/>
-              <w:jc w:val="center"/>
-            </w:pPr>
-            <w:r>
-              <w:t xml:space="preserve">☐</w:t>
-            </w:r>
-          </w:p>
-        </w:tc>
-        <w:tc>
-          <w:tcPr/>
-          <w:p>
-            <w:pPr>
-              <w:pStyle w:val="Compact"/>
-              <w:jc w:val="center"/>
-            </w:pPr>
-            <w:r>
-              <w:t xml:space="preserve">☐</w:t>
-            </w:r>
-          </w:p>
-        </w:tc>
-        <w:tc>
-          <w:tcPr/>
-          <w:p>
-            <w:pPr>
-              <w:pStyle w:val="Compact"/>
-              <w:jc w:val="center"/>
-            </w:pPr>
-            <w:r>
-              <w:t xml:space="preserve">☐</w:t>
-            </w:r>
+            </w:pPr>
+          </w:p>
+        </w:tc>
+        <w:tc>
+          <w:tcPr/>
+          <w:p>
+            <w:pPr>
+              <w:pStyle w:val="Compact"/>
+            </w:pPr>
+          </w:p>
+        </w:tc>
+        <w:tc>
+          <w:tcPr/>
+          <w:p>
+            <w:pPr>
+              <w:pStyle w:val="Compact"/>
+            </w:pPr>
+          </w:p>
+        </w:tc>
+        <w:tc>
+          <w:tcPr/>
+          <w:p>
+            <w:pPr>
+              <w:pStyle w:val="Compact"/>
+            </w:pPr>
+          </w:p>
+        </w:tc>
+        <w:tc>
+          <w:tcPr/>
+          <w:p>
+            <w:pPr>
+              <w:pStyle w:val="Compact"/>
+            </w:pPr>
           </w:p>
         </w:tc>
       </w:tr>
@@ -1407,59 +1147,39 @@
           <w:p>
             <w:pPr>
               <w:pStyle w:val="Compact"/>
-              <w:jc w:val="center"/>
-            </w:pPr>
-            <w:r>
-              <w:t xml:space="preserve">☐</w:t>
-            </w:r>
-          </w:p>
-        </w:tc>
-        <w:tc>
-          <w:tcPr/>
-          <w:p>
-            <w:pPr>
-              <w:pStyle w:val="Compact"/>
-              <w:jc w:val="center"/>
-            </w:pPr>
-            <w:r>
-              <w:t xml:space="preserve">☐</w:t>
-            </w:r>
-          </w:p>
-        </w:tc>
-        <w:tc>
-          <w:tcPr/>
-          <w:p>
-            <w:pPr>
-              <w:pStyle w:val="Compact"/>
-              <w:jc w:val="center"/>
-            </w:pPr>
-            <w:r>
-              <w:t xml:space="preserve">☐</w:t>
-            </w:r>
-          </w:p>
-        </w:tc>
-        <w:tc>
-          <w:tcPr/>
-          <w:p>
-            <w:pPr>
-              <w:pStyle w:val="Compact"/>
-              <w:jc w:val="center"/>
-            </w:pPr>
-            <w:r>
-              <w:t xml:space="preserve">☐</w:t>
-            </w:r>
-          </w:p>
-        </w:tc>
-        <w:tc>
-          <w:tcPr/>
-          <w:p>
-            <w:pPr>
-              <w:pStyle w:val="Compact"/>
-              <w:jc w:val="center"/>
-            </w:pPr>
-            <w:r>
-              <w:t xml:space="preserve">☐</w:t>
-            </w:r>
+            </w:pPr>
+          </w:p>
+        </w:tc>
+        <w:tc>
+          <w:tcPr/>
+          <w:p>
+            <w:pPr>
+              <w:pStyle w:val="Compact"/>
+            </w:pPr>
+          </w:p>
+        </w:tc>
+        <w:tc>
+          <w:tcPr/>
+          <w:p>
+            <w:pPr>
+              <w:pStyle w:val="Compact"/>
+            </w:pPr>
+          </w:p>
+        </w:tc>
+        <w:tc>
+          <w:tcPr/>
+          <w:p>
+            <w:pPr>
+              <w:pStyle w:val="Compact"/>
+            </w:pPr>
+          </w:p>
+        </w:tc>
+        <w:tc>
+          <w:tcPr/>
+          <w:p>
+            <w:pPr>
+              <w:pStyle w:val="Compact"/>
+            </w:pPr>
           </w:p>
         </w:tc>
       </w:tr>
@@ -1480,59 +1200,39 @@
           <w:p>
             <w:pPr>
               <w:pStyle w:val="Compact"/>
-              <w:jc w:val="center"/>
-            </w:pPr>
-            <w:r>
-              <w:t xml:space="preserve">☐</w:t>
-            </w:r>
-          </w:p>
-        </w:tc>
-        <w:tc>
-          <w:tcPr/>
-          <w:p>
-            <w:pPr>
-              <w:pStyle w:val="Compact"/>
-              <w:jc w:val="center"/>
-            </w:pPr>
-            <w:r>
-              <w:t xml:space="preserve">☐</w:t>
-            </w:r>
-          </w:p>
-        </w:tc>
-        <w:tc>
-          <w:tcPr/>
-          <w:p>
-            <w:pPr>
-              <w:pStyle w:val="Compact"/>
-              <w:jc w:val="center"/>
-            </w:pPr>
-            <w:r>
-              <w:t xml:space="preserve">☐</w:t>
-            </w:r>
-          </w:p>
-        </w:tc>
-        <w:tc>
-          <w:tcPr/>
-          <w:p>
-            <w:pPr>
-              <w:pStyle w:val="Compact"/>
-              <w:jc w:val="center"/>
-            </w:pPr>
-            <w:r>
-              <w:t xml:space="preserve">☐</w:t>
-            </w:r>
-          </w:p>
-        </w:tc>
-        <w:tc>
-          <w:tcPr/>
-          <w:p>
-            <w:pPr>
-              <w:pStyle w:val="Compact"/>
-              <w:jc w:val="center"/>
-            </w:pPr>
-            <w:r>
-              <w:t xml:space="preserve">☐</w:t>
-            </w:r>
+            </w:pPr>
+          </w:p>
+        </w:tc>
+        <w:tc>
+          <w:tcPr/>
+          <w:p>
+            <w:pPr>
+              <w:pStyle w:val="Compact"/>
+            </w:pPr>
+          </w:p>
+        </w:tc>
+        <w:tc>
+          <w:tcPr/>
+          <w:p>
+            <w:pPr>
+              <w:pStyle w:val="Compact"/>
+            </w:pPr>
+          </w:p>
+        </w:tc>
+        <w:tc>
+          <w:tcPr/>
+          <w:p>
+            <w:pPr>
+              <w:pStyle w:val="Compact"/>
+            </w:pPr>
+          </w:p>
+        </w:tc>
+        <w:tc>
+          <w:tcPr/>
+          <w:p>
+            <w:pPr>
+              <w:pStyle w:val="Compact"/>
+            </w:pPr>
           </w:p>
         </w:tc>
       </w:tr>
@@ -1553,59 +1253,39 @@
           <w:p>
             <w:pPr>
               <w:pStyle w:val="Compact"/>
-              <w:jc w:val="center"/>
-            </w:pPr>
-            <w:r>
-              <w:t xml:space="preserve">☐</w:t>
-            </w:r>
-          </w:p>
-        </w:tc>
-        <w:tc>
-          <w:tcPr/>
-          <w:p>
-            <w:pPr>
-              <w:pStyle w:val="Compact"/>
-              <w:jc w:val="center"/>
-            </w:pPr>
-            <w:r>
-              <w:t xml:space="preserve">☐</w:t>
-            </w:r>
-          </w:p>
-        </w:tc>
-        <w:tc>
-          <w:tcPr/>
-          <w:p>
-            <w:pPr>
-              <w:pStyle w:val="Compact"/>
-              <w:jc w:val="center"/>
-            </w:pPr>
-            <w:r>
-              <w:t xml:space="preserve">☐</w:t>
-            </w:r>
-          </w:p>
-        </w:tc>
-        <w:tc>
-          <w:tcPr/>
-          <w:p>
-            <w:pPr>
-              <w:pStyle w:val="Compact"/>
-              <w:jc w:val="center"/>
-            </w:pPr>
-            <w:r>
-              <w:t xml:space="preserve">☐</w:t>
-            </w:r>
-          </w:p>
-        </w:tc>
-        <w:tc>
-          <w:tcPr/>
-          <w:p>
-            <w:pPr>
-              <w:pStyle w:val="Compact"/>
-              <w:jc w:val="center"/>
-            </w:pPr>
-            <w:r>
-              <w:t xml:space="preserve">☐</w:t>
-            </w:r>
+            </w:pPr>
+          </w:p>
+        </w:tc>
+        <w:tc>
+          <w:tcPr/>
+          <w:p>
+            <w:pPr>
+              <w:pStyle w:val="Compact"/>
+            </w:pPr>
+          </w:p>
+        </w:tc>
+        <w:tc>
+          <w:tcPr/>
+          <w:p>
+            <w:pPr>
+              <w:pStyle w:val="Compact"/>
+            </w:pPr>
+          </w:p>
+        </w:tc>
+        <w:tc>
+          <w:tcPr/>
+          <w:p>
+            <w:pPr>
+              <w:pStyle w:val="Compact"/>
+            </w:pPr>
+          </w:p>
+        </w:tc>
+        <w:tc>
+          <w:tcPr/>
+          <w:p>
+            <w:pPr>
+              <w:pStyle w:val="Compact"/>
+            </w:pPr>
           </w:p>
         </w:tc>
       </w:tr>
@@ -1683,59 +1363,39 @@
           <w:p>
             <w:pPr>
               <w:pStyle w:val="Compact"/>
-              <w:jc w:val="center"/>
-            </w:pPr>
-            <w:r>
-              <w:t xml:space="preserve">☐</w:t>
-            </w:r>
-          </w:p>
-        </w:tc>
-        <w:tc>
-          <w:tcPr/>
-          <w:p>
-            <w:pPr>
-              <w:pStyle w:val="Compact"/>
-              <w:jc w:val="center"/>
-            </w:pPr>
-            <w:r>
-              <w:t xml:space="preserve">☐</w:t>
-            </w:r>
-          </w:p>
-        </w:tc>
-        <w:tc>
-          <w:tcPr/>
-          <w:p>
-            <w:pPr>
-              <w:pStyle w:val="Compact"/>
-              <w:jc w:val="center"/>
-            </w:pPr>
-            <w:r>
-              <w:t xml:space="preserve">☐</w:t>
-            </w:r>
-          </w:p>
-        </w:tc>
-        <w:tc>
-          <w:tcPr/>
-          <w:p>
-            <w:pPr>
-              <w:pStyle w:val="Compact"/>
-              <w:jc w:val="center"/>
-            </w:pPr>
-            <w:r>
-              <w:t xml:space="preserve">☐</w:t>
-            </w:r>
-          </w:p>
-        </w:tc>
-        <w:tc>
-          <w:tcPr/>
-          <w:p>
-            <w:pPr>
-              <w:pStyle w:val="Compact"/>
-              <w:jc w:val="center"/>
-            </w:pPr>
-            <w:r>
-              <w:t xml:space="preserve">☐</w:t>
-            </w:r>
+            </w:pPr>
+          </w:p>
+        </w:tc>
+        <w:tc>
+          <w:tcPr/>
+          <w:p>
+            <w:pPr>
+              <w:pStyle w:val="Compact"/>
+            </w:pPr>
+          </w:p>
+        </w:tc>
+        <w:tc>
+          <w:tcPr/>
+          <w:p>
+            <w:pPr>
+              <w:pStyle w:val="Compact"/>
+            </w:pPr>
+          </w:p>
+        </w:tc>
+        <w:tc>
+          <w:tcPr/>
+          <w:p>
+            <w:pPr>
+              <w:pStyle w:val="Compact"/>
+            </w:pPr>
+          </w:p>
+        </w:tc>
+        <w:tc>
+          <w:tcPr/>
+          <w:p>
+            <w:pPr>
+              <w:pStyle w:val="Compact"/>
+            </w:pPr>
           </w:p>
         </w:tc>
       </w:tr>
@@ -1756,59 +1416,39 @@
           <w:p>
             <w:pPr>
               <w:pStyle w:val="Compact"/>
-              <w:jc w:val="center"/>
-            </w:pPr>
-            <w:r>
-              <w:t xml:space="preserve">☐</w:t>
-            </w:r>
-          </w:p>
-        </w:tc>
-        <w:tc>
-          <w:tcPr/>
-          <w:p>
-            <w:pPr>
-              <w:pStyle w:val="Compact"/>
-              <w:jc w:val="center"/>
-            </w:pPr>
-            <w:r>
-              <w:t xml:space="preserve">☐</w:t>
-            </w:r>
-          </w:p>
-        </w:tc>
-        <w:tc>
-          <w:tcPr/>
-          <w:p>
-            <w:pPr>
-              <w:pStyle w:val="Compact"/>
-              <w:jc w:val="center"/>
-            </w:pPr>
-            <w:r>
-              <w:t xml:space="preserve">☐</w:t>
-            </w:r>
-          </w:p>
-        </w:tc>
-        <w:tc>
-          <w:tcPr/>
-          <w:p>
-            <w:pPr>
-              <w:pStyle w:val="Compact"/>
-              <w:jc w:val="center"/>
-            </w:pPr>
-            <w:r>
-              <w:t xml:space="preserve">☐</w:t>
-            </w:r>
-          </w:p>
-        </w:tc>
-        <w:tc>
-          <w:tcPr/>
-          <w:p>
-            <w:pPr>
-              <w:pStyle w:val="Compact"/>
-              <w:jc w:val="center"/>
-            </w:pPr>
-            <w:r>
-              <w:t xml:space="preserve">☐</w:t>
-            </w:r>
+            </w:pPr>
+          </w:p>
+        </w:tc>
+        <w:tc>
+          <w:tcPr/>
+          <w:p>
+            <w:pPr>
+              <w:pStyle w:val="Compact"/>
+            </w:pPr>
+          </w:p>
+        </w:tc>
+        <w:tc>
+          <w:tcPr/>
+          <w:p>
+            <w:pPr>
+              <w:pStyle w:val="Compact"/>
+            </w:pPr>
+          </w:p>
+        </w:tc>
+        <w:tc>
+          <w:tcPr/>
+          <w:p>
+            <w:pPr>
+              <w:pStyle w:val="Compact"/>
+            </w:pPr>
+          </w:p>
+        </w:tc>
+        <w:tc>
+          <w:tcPr/>
+          <w:p>
+            <w:pPr>
+              <w:pStyle w:val="Compact"/>
+            </w:pPr>
           </w:p>
         </w:tc>
       </w:tr>
@@ -1829,59 +1469,39 @@
           <w:p>
             <w:pPr>
               <w:pStyle w:val="Compact"/>
-              <w:jc w:val="center"/>
-            </w:pPr>
-            <w:r>
-              <w:t xml:space="preserve">☐</w:t>
-            </w:r>
-          </w:p>
-        </w:tc>
-        <w:tc>
-          <w:tcPr/>
-          <w:p>
-            <w:pPr>
-              <w:pStyle w:val="Compact"/>
-              <w:jc w:val="center"/>
-            </w:pPr>
-            <w:r>
-              <w:t xml:space="preserve">☐</w:t>
-            </w:r>
-          </w:p>
-        </w:tc>
-        <w:tc>
-          <w:tcPr/>
-          <w:p>
-            <w:pPr>
-              <w:pStyle w:val="Compact"/>
-              <w:jc w:val="center"/>
-            </w:pPr>
-            <w:r>
-              <w:t xml:space="preserve">☐</w:t>
-            </w:r>
-          </w:p>
-        </w:tc>
-        <w:tc>
-          <w:tcPr/>
-          <w:p>
-            <w:pPr>
-              <w:pStyle w:val="Compact"/>
-              <w:jc w:val="center"/>
-            </w:pPr>
-            <w:r>
-              <w:t xml:space="preserve">☐</w:t>
-            </w:r>
-          </w:p>
-        </w:tc>
-        <w:tc>
-          <w:tcPr/>
-          <w:p>
-            <w:pPr>
-              <w:pStyle w:val="Compact"/>
-              <w:jc w:val="center"/>
-            </w:pPr>
-            <w:r>
-              <w:t xml:space="preserve">☐</w:t>
-            </w:r>
+            </w:pPr>
+          </w:p>
+        </w:tc>
+        <w:tc>
+          <w:tcPr/>
+          <w:p>
+            <w:pPr>
+              <w:pStyle w:val="Compact"/>
+            </w:pPr>
+          </w:p>
+        </w:tc>
+        <w:tc>
+          <w:tcPr/>
+          <w:p>
+            <w:pPr>
+              <w:pStyle w:val="Compact"/>
+            </w:pPr>
+          </w:p>
+        </w:tc>
+        <w:tc>
+          <w:tcPr/>
+          <w:p>
+            <w:pPr>
+              <w:pStyle w:val="Compact"/>
+            </w:pPr>
+          </w:p>
+        </w:tc>
+        <w:tc>
+          <w:tcPr/>
+          <w:p>
+            <w:pPr>
+              <w:pStyle w:val="Compact"/>
+            </w:pPr>
           </w:p>
         </w:tc>
       </w:tr>
@@ -1902,59 +1522,39 @@
           <w:p>
             <w:pPr>
               <w:pStyle w:val="Compact"/>
-              <w:jc w:val="center"/>
-            </w:pPr>
-            <w:r>
-              <w:t xml:space="preserve">☐</w:t>
-            </w:r>
-          </w:p>
-        </w:tc>
-        <w:tc>
-          <w:tcPr/>
-          <w:p>
-            <w:pPr>
-              <w:pStyle w:val="Compact"/>
-              <w:jc w:val="center"/>
-            </w:pPr>
-            <w:r>
-              <w:t xml:space="preserve">☐</w:t>
-            </w:r>
-          </w:p>
-        </w:tc>
-        <w:tc>
-          <w:tcPr/>
-          <w:p>
-            <w:pPr>
-              <w:pStyle w:val="Compact"/>
-              <w:jc w:val="center"/>
-            </w:pPr>
-            <w:r>
-              <w:t xml:space="preserve">☐</w:t>
-            </w:r>
-          </w:p>
-        </w:tc>
-        <w:tc>
-          <w:tcPr/>
-          <w:p>
-            <w:pPr>
-              <w:pStyle w:val="Compact"/>
-              <w:jc w:val="center"/>
-            </w:pPr>
-            <w:r>
-              <w:t xml:space="preserve">☐</w:t>
-            </w:r>
-          </w:p>
-        </w:tc>
-        <w:tc>
-          <w:tcPr/>
-          <w:p>
-            <w:pPr>
-              <w:pStyle w:val="Compact"/>
-              <w:jc w:val="center"/>
-            </w:pPr>
-            <w:r>
-              <w:t xml:space="preserve">☐</w:t>
-            </w:r>
+            </w:pPr>
+          </w:p>
+        </w:tc>
+        <w:tc>
+          <w:tcPr/>
+          <w:p>
+            <w:pPr>
+              <w:pStyle w:val="Compact"/>
+            </w:pPr>
+          </w:p>
+        </w:tc>
+        <w:tc>
+          <w:tcPr/>
+          <w:p>
+            <w:pPr>
+              <w:pStyle w:val="Compact"/>
+            </w:pPr>
+          </w:p>
+        </w:tc>
+        <w:tc>
+          <w:tcPr/>
+          <w:p>
+            <w:pPr>
+              <w:pStyle w:val="Compact"/>
+            </w:pPr>
+          </w:p>
+        </w:tc>
+        <w:tc>
+          <w:tcPr/>
+          <w:p>
+            <w:pPr>
+              <w:pStyle w:val="Compact"/>
+            </w:pPr>
           </w:p>
         </w:tc>
       </w:tr>
@@ -1975,59 +1575,39 @@
           <w:p>
             <w:pPr>
               <w:pStyle w:val="Compact"/>
-              <w:jc w:val="center"/>
-            </w:pPr>
-            <w:r>
-              <w:t xml:space="preserve">☐</w:t>
-            </w:r>
-          </w:p>
-        </w:tc>
-        <w:tc>
-          <w:tcPr/>
-          <w:p>
-            <w:pPr>
-              <w:pStyle w:val="Compact"/>
-              <w:jc w:val="center"/>
-            </w:pPr>
-            <w:r>
-              <w:t xml:space="preserve">☐</w:t>
-            </w:r>
-          </w:p>
-        </w:tc>
-        <w:tc>
-          <w:tcPr/>
-          <w:p>
-            <w:pPr>
-              <w:pStyle w:val="Compact"/>
-              <w:jc w:val="center"/>
-            </w:pPr>
-            <w:r>
-              <w:t xml:space="preserve">☐</w:t>
-            </w:r>
-          </w:p>
-        </w:tc>
-        <w:tc>
-          <w:tcPr/>
-          <w:p>
-            <w:pPr>
-              <w:pStyle w:val="Compact"/>
-              <w:jc w:val="center"/>
-            </w:pPr>
-            <w:r>
-              <w:t xml:space="preserve">☐</w:t>
-            </w:r>
-          </w:p>
-        </w:tc>
-        <w:tc>
-          <w:tcPr/>
-          <w:p>
-            <w:pPr>
-              <w:pStyle w:val="Compact"/>
-              <w:jc w:val="center"/>
-            </w:pPr>
-            <w:r>
-              <w:t xml:space="preserve">☐</w:t>
-            </w:r>
+            </w:pPr>
+          </w:p>
+        </w:tc>
+        <w:tc>
+          <w:tcPr/>
+          <w:p>
+            <w:pPr>
+              <w:pStyle w:val="Compact"/>
+            </w:pPr>
+          </w:p>
+        </w:tc>
+        <w:tc>
+          <w:tcPr/>
+          <w:p>
+            <w:pPr>
+              <w:pStyle w:val="Compact"/>
+            </w:pPr>
+          </w:p>
+        </w:tc>
+        <w:tc>
+          <w:tcPr/>
+          <w:p>
+            <w:pPr>
+              <w:pStyle w:val="Compact"/>
+            </w:pPr>
+          </w:p>
+        </w:tc>
+        <w:tc>
+          <w:tcPr/>
+          <w:p>
+            <w:pPr>
+              <w:pStyle w:val="Compact"/>
+            </w:pPr>
           </w:p>
         </w:tc>
       </w:tr>
@@ -2048,59 +1628,39 @@
           <w:p>
             <w:pPr>
               <w:pStyle w:val="Compact"/>
-              <w:jc w:val="center"/>
-            </w:pPr>
-            <w:r>
-              <w:t xml:space="preserve">☐</w:t>
-            </w:r>
-          </w:p>
-        </w:tc>
-        <w:tc>
-          <w:tcPr/>
-          <w:p>
-            <w:pPr>
-              <w:pStyle w:val="Compact"/>
-              <w:jc w:val="center"/>
-            </w:pPr>
-            <w:r>
-              <w:t xml:space="preserve">☐</w:t>
-            </w:r>
-          </w:p>
-        </w:tc>
-        <w:tc>
-          <w:tcPr/>
-          <w:p>
-            <w:pPr>
-              <w:pStyle w:val="Compact"/>
-              <w:jc w:val="center"/>
-            </w:pPr>
-            <w:r>
-              <w:t xml:space="preserve">☐</w:t>
-            </w:r>
-          </w:p>
-        </w:tc>
-        <w:tc>
-          <w:tcPr/>
-          <w:p>
-            <w:pPr>
-              <w:pStyle w:val="Compact"/>
-              <w:jc w:val="center"/>
-            </w:pPr>
-            <w:r>
-              <w:t xml:space="preserve">☐</w:t>
-            </w:r>
-          </w:p>
-        </w:tc>
-        <w:tc>
-          <w:tcPr/>
-          <w:p>
-            <w:pPr>
-              <w:pStyle w:val="Compact"/>
-              <w:jc w:val="center"/>
-            </w:pPr>
-            <w:r>
-              <w:t xml:space="preserve">☐</w:t>
-            </w:r>
+            </w:pPr>
+          </w:p>
+        </w:tc>
+        <w:tc>
+          <w:tcPr/>
+          <w:p>
+            <w:pPr>
+              <w:pStyle w:val="Compact"/>
+            </w:pPr>
+          </w:p>
+        </w:tc>
+        <w:tc>
+          <w:tcPr/>
+          <w:p>
+            <w:pPr>
+              <w:pStyle w:val="Compact"/>
+            </w:pPr>
+          </w:p>
+        </w:tc>
+        <w:tc>
+          <w:tcPr/>
+          <w:p>
+            <w:pPr>
+              <w:pStyle w:val="Compact"/>
+            </w:pPr>
+          </w:p>
+        </w:tc>
+        <w:tc>
+          <w:tcPr/>
+          <w:p>
+            <w:pPr>
+              <w:pStyle w:val="Compact"/>
+            </w:pPr>
           </w:p>
         </w:tc>
       </w:tr>
@@ -2178,59 +1738,39 @@
           <w:p>
             <w:pPr>
               <w:pStyle w:val="Compact"/>
-              <w:jc w:val="center"/>
-            </w:pPr>
-            <w:r>
-              <w:t xml:space="preserve">☐</w:t>
-            </w:r>
-          </w:p>
-        </w:tc>
-        <w:tc>
-          <w:tcPr/>
-          <w:p>
-            <w:pPr>
-              <w:pStyle w:val="Compact"/>
-              <w:jc w:val="center"/>
-            </w:pPr>
-            <w:r>
-              <w:t xml:space="preserve">☐</w:t>
-            </w:r>
-          </w:p>
-        </w:tc>
-        <w:tc>
-          <w:tcPr/>
-          <w:p>
-            <w:pPr>
-              <w:pStyle w:val="Compact"/>
-              <w:jc w:val="center"/>
-            </w:pPr>
-            <w:r>
-              <w:t xml:space="preserve">☐</w:t>
-            </w:r>
-          </w:p>
-        </w:tc>
-        <w:tc>
-          <w:tcPr/>
-          <w:p>
-            <w:pPr>
-              <w:pStyle w:val="Compact"/>
-              <w:jc w:val="center"/>
-            </w:pPr>
-            <w:r>
-              <w:t xml:space="preserve">☐</w:t>
-            </w:r>
-          </w:p>
-        </w:tc>
-        <w:tc>
-          <w:tcPr/>
-          <w:p>
-            <w:pPr>
-              <w:pStyle w:val="Compact"/>
-              <w:jc w:val="center"/>
-            </w:pPr>
-            <w:r>
-              <w:t xml:space="preserve">☐</w:t>
-            </w:r>
+            </w:pPr>
+          </w:p>
+        </w:tc>
+        <w:tc>
+          <w:tcPr/>
+          <w:p>
+            <w:pPr>
+              <w:pStyle w:val="Compact"/>
+            </w:pPr>
+          </w:p>
+        </w:tc>
+        <w:tc>
+          <w:tcPr/>
+          <w:p>
+            <w:pPr>
+              <w:pStyle w:val="Compact"/>
+            </w:pPr>
+          </w:p>
+        </w:tc>
+        <w:tc>
+          <w:tcPr/>
+          <w:p>
+            <w:pPr>
+              <w:pStyle w:val="Compact"/>
+            </w:pPr>
+          </w:p>
+        </w:tc>
+        <w:tc>
+          <w:tcPr/>
+          <w:p>
+            <w:pPr>
+              <w:pStyle w:val="Compact"/>
+            </w:pPr>
           </w:p>
         </w:tc>
       </w:tr>
@@ -2251,59 +1791,39 @@
           <w:p>
             <w:pPr>
               <w:pStyle w:val="Compact"/>
-              <w:jc w:val="center"/>
-            </w:pPr>
-            <w:r>
-              <w:t xml:space="preserve">☐</w:t>
-            </w:r>
-          </w:p>
-        </w:tc>
-        <w:tc>
-          <w:tcPr/>
-          <w:p>
-            <w:pPr>
-              <w:pStyle w:val="Compact"/>
-              <w:jc w:val="center"/>
-            </w:pPr>
-            <w:r>
-              <w:t xml:space="preserve">☐</w:t>
-            </w:r>
-          </w:p>
-        </w:tc>
-        <w:tc>
-          <w:tcPr/>
-          <w:p>
-            <w:pPr>
-              <w:pStyle w:val="Compact"/>
-              <w:jc w:val="center"/>
-            </w:pPr>
-            <w:r>
-              <w:t xml:space="preserve">☐</w:t>
-            </w:r>
-          </w:p>
-        </w:tc>
-        <w:tc>
-          <w:tcPr/>
-          <w:p>
-            <w:pPr>
-              <w:pStyle w:val="Compact"/>
-              <w:jc w:val="center"/>
-            </w:pPr>
-            <w:r>
-              <w:t xml:space="preserve">☐</w:t>
-            </w:r>
-          </w:p>
-        </w:tc>
-        <w:tc>
-          <w:tcPr/>
-          <w:p>
-            <w:pPr>
-              <w:pStyle w:val="Compact"/>
-              <w:jc w:val="center"/>
-            </w:pPr>
-            <w:r>
-              <w:t xml:space="preserve">☐</w:t>
-            </w:r>
+            </w:pPr>
+          </w:p>
+        </w:tc>
+        <w:tc>
+          <w:tcPr/>
+          <w:p>
+            <w:pPr>
+              <w:pStyle w:val="Compact"/>
+            </w:pPr>
+          </w:p>
+        </w:tc>
+        <w:tc>
+          <w:tcPr/>
+          <w:p>
+            <w:pPr>
+              <w:pStyle w:val="Compact"/>
+            </w:pPr>
+          </w:p>
+        </w:tc>
+        <w:tc>
+          <w:tcPr/>
+          <w:p>
+            <w:pPr>
+              <w:pStyle w:val="Compact"/>
+            </w:pPr>
+          </w:p>
+        </w:tc>
+        <w:tc>
+          <w:tcPr/>
+          <w:p>
+            <w:pPr>
+              <w:pStyle w:val="Compact"/>
+            </w:pPr>
           </w:p>
         </w:tc>
       </w:tr>
@@ -2324,59 +1844,39 @@
           <w:p>
             <w:pPr>
               <w:pStyle w:val="Compact"/>
-              <w:jc w:val="center"/>
-            </w:pPr>
-            <w:r>
-              <w:t xml:space="preserve">☐</w:t>
-            </w:r>
-          </w:p>
-        </w:tc>
-        <w:tc>
-          <w:tcPr/>
-          <w:p>
-            <w:pPr>
-              <w:pStyle w:val="Compact"/>
-              <w:jc w:val="center"/>
-            </w:pPr>
-            <w:r>
-              <w:t xml:space="preserve">☐</w:t>
-            </w:r>
-          </w:p>
-        </w:tc>
-        <w:tc>
-          <w:tcPr/>
-          <w:p>
-            <w:pPr>
-              <w:pStyle w:val="Compact"/>
-              <w:jc w:val="center"/>
-            </w:pPr>
-            <w:r>
-              <w:t xml:space="preserve">☐</w:t>
-            </w:r>
-          </w:p>
-        </w:tc>
-        <w:tc>
-          <w:tcPr/>
-          <w:p>
-            <w:pPr>
-              <w:pStyle w:val="Compact"/>
-              <w:jc w:val="center"/>
-            </w:pPr>
-            <w:r>
-              <w:t xml:space="preserve">☐</w:t>
-            </w:r>
-          </w:p>
-        </w:tc>
-        <w:tc>
-          <w:tcPr/>
-          <w:p>
-            <w:pPr>
-              <w:pStyle w:val="Compact"/>
-              <w:jc w:val="center"/>
-            </w:pPr>
-            <w:r>
-              <w:t xml:space="preserve">☐</w:t>
-            </w:r>
+            </w:pPr>
+          </w:p>
+        </w:tc>
+        <w:tc>
+          <w:tcPr/>
+          <w:p>
+            <w:pPr>
+              <w:pStyle w:val="Compact"/>
+            </w:pPr>
+          </w:p>
+        </w:tc>
+        <w:tc>
+          <w:tcPr/>
+          <w:p>
+            <w:pPr>
+              <w:pStyle w:val="Compact"/>
+            </w:pPr>
+          </w:p>
+        </w:tc>
+        <w:tc>
+          <w:tcPr/>
+          <w:p>
+            <w:pPr>
+              <w:pStyle w:val="Compact"/>
+            </w:pPr>
+          </w:p>
+        </w:tc>
+        <w:tc>
+          <w:tcPr/>
+          <w:p>
+            <w:pPr>
+              <w:pStyle w:val="Compact"/>
+            </w:pPr>
           </w:p>
         </w:tc>
       </w:tr>
@@ -2397,59 +1897,39 @@
           <w:p>
             <w:pPr>
               <w:pStyle w:val="Compact"/>
-              <w:jc w:val="center"/>
-            </w:pPr>
-            <w:r>
-              <w:t xml:space="preserve">☐</w:t>
-            </w:r>
-          </w:p>
-        </w:tc>
-        <w:tc>
-          <w:tcPr/>
-          <w:p>
-            <w:pPr>
-              <w:pStyle w:val="Compact"/>
-              <w:jc w:val="center"/>
-            </w:pPr>
-            <w:r>
-              <w:t xml:space="preserve">☐</w:t>
-            </w:r>
-          </w:p>
-        </w:tc>
-        <w:tc>
-          <w:tcPr/>
-          <w:p>
-            <w:pPr>
-              <w:pStyle w:val="Compact"/>
-              <w:jc w:val="center"/>
-            </w:pPr>
-            <w:r>
-              <w:t xml:space="preserve">☐</w:t>
-            </w:r>
-          </w:p>
-        </w:tc>
-        <w:tc>
-          <w:tcPr/>
-          <w:p>
-            <w:pPr>
-              <w:pStyle w:val="Compact"/>
-              <w:jc w:val="center"/>
-            </w:pPr>
-            <w:r>
-              <w:t xml:space="preserve">☐</w:t>
-            </w:r>
-          </w:p>
-        </w:tc>
-        <w:tc>
-          <w:tcPr/>
-          <w:p>
-            <w:pPr>
-              <w:pStyle w:val="Compact"/>
-              <w:jc w:val="center"/>
-            </w:pPr>
-            <w:r>
-              <w:t xml:space="preserve">☐</w:t>
-            </w:r>
+            </w:pPr>
+          </w:p>
+        </w:tc>
+        <w:tc>
+          <w:tcPr/>
+          <w:p>
+            <w:pPr>
+              <w:pStyle w:val="Compact"/>
+            </w:pPr>
+          </w:p>
+        </w:tc>
+        <w:tc>
+          <w:tcPr/>
+          <w:p>
+            <w:pPr>
+              <w:pStyle w:val="Compact"/>
+            </w:pPr>
+          </w:p>
+        </w:tc>
+        <w:tc>
+          <w:tcPr/>
+          <w:p>
+            <w:pPr>
+              <w:pStyle w:val="Compact"/>
+            </w:pPr>
+          </w:p>
+        </w:tc>
+        <w:tc>
+          <w:tcPr/>
+          <w:p>
+            <w:pPr>
+              <w:pStyle w:val="Compact"/>
+            </w:pPr>
           </w:p>
         </w:tc>
       </w:tr>

</xml_diff>